<commit_message>
customer statement - added sixth address line
</commit_message>
<xml_diff>
--- a/Campbellford Extension/src/WordLayouts/CFS Customer Statement.docx
+++ b/Campbellford Extension/src/WordLayouts/CFS Customer Statement.docx
@@ -285,6 +285,41 @@
                           </w:rPr>
                           <w:br/>
                         </w:r>
+                        <w:sdt>
+                          <w:sdtPr>
+                            <w:rPr>
+                              <w:rFonts w:ascii="Segoe UI" w:hAnsi="Segoe UI" w:cs="Segoe UI"/>
+                              <w:sz w:val="18"/>
+                              <w:szCs w:val="18"/>
+                            </w:rPr>
+                            <w:id w:val="-2099781677"/>
+                            <w:placeholder>
+                              <w:docPart w:val="DefaultPlaceholder_-1854013440"/>
+                            </w:placeholder>
+                            <w:dataBinding w:prefixMappings="xmlns:ns0='urn:microsoft-dynamics-nav/reports/Standard_Statement/1316/' " w:xpath="/ns0:NavWordReportXmlPart[1]/ns0:Customer[1]/ns0:CFSCustAddress6[1]" w:storeItemID="{6DA4901C-D430-4D4B-9017-1CE2DD1B612E}"/>
+                            <w:text/>
+                            <w:alias w:val="#Nav: /Customer/CFSCustAddress6"/>
+                            <w:tag w:val="#Nav: Standard_Statement/1316"/>
+                          </w:sdtPr>
+                          <w:sdtContent>
+                            <w:r>
+                              <w:rPr>
+                                <w:rFonts w:ascii="Segoe UI" w:hAnsi="Segoe UI" w:cs="Segoe UI"/>
+                                <w:sz w:val="18"/>
+                                <w:szCs w:val="18"/>
+                              </w:rPr>
+                              <w:t>CFSCustAddress6</w:t>
+                            </w:r>
+                          </w:sdtContent>
+                        </w:sdt>
+                        <w:r>
+                          <w:rPr>
+                            <w:rFonts w:ascii="Segoe UI" w:hAnsi="Segoe UI" w:cs="Segoe UI"/>
+                            <w:sz w:val="18"/>
+                            <w:szCs w:val="18"/>
+                          </w:rPr>
+                          <w:br/>
+                        </w:r>
                       </w:p>
                     </w:tc>
                   </w:tr>
@@ -350,7 +385,6 @@
                                 <w:szCs w:val="16"/>
                               </w:rPr>
                             </w:pPr>
-                            <w:proofErr w:type="spellStart"/>
                             <w:r>
                               <w:rPr>
                                 <w:rFonts w:ascii="Segoe UI" w:hAnsi="Segoe UI" w:cs="Segoe UI"/>
@@ -359,7 +393,6 @@
                               </w:rPr>
                               <w:t>DocDateCaption</w:t>
                             </w:r>
-                            <w:proofErr w:type="spellEnd"/>
                           </w:p>
                         </w:tc>
                       </w:sdtContent>
@@ -393,7 +426,6 @@
                                 <w:szCs w:val="16"/>
                               </w:rPr>
                             </w:pPr>
-                            <w:proofErr w:type="spellStart"/>
                             <w:r>
                               <w:rPr>
                                 <w:rFonts w:ascii="Segoe UI" w:hAnsi="Segoe UI" w:cs="Segoe UI"/>
@@ -402,7 +434,6 @@
                               </w:rPr>
                               <w:t>TodayFormatted</w:t>
                             </w:r>
-                            <w:proofErr w:type="spellEnd"/>
                           </w:p>
                         </w:tc>
                       </w:sdtContent>
@@ -438,7 +469,6 @@
                                 <w:szCs w:val="16"/>
                               </w:rPr>
                             </w:pPr>
-                            <w:proofErr w:type="spellStart"/>
                             <w:r>
                               <w:rPr>
                                 <w:rFonts w:ascii="Segoe UI" w:hAnsi="Segoe UI" w:cs="Segoe UI"/>
@@ -447,7 +477,6 @@
                               </w:rPr>
                               <w:t>StartDateCaption</w:t>
                             </w:r>
-                            <w:proofErr w:type="spellEnd"/>
                           </w:p>
                         </w:tc>
                       </w:sdtContent>
@@ -524,7 +553,6 @@
                                 <w:szCs w:val="16"/>
                               </w:rPr>
                             </w:pPr>
-                            <w:proofErr w:type="spellStart"/>
                             <w:r>
                               <w:rPr>
                                 <w:rFonts w:ascii="Segoe UI" w:hAnsi="Segoe UI" w:cs="Segoe UI"/>
@@ -533,7 +561,6 @@
                               </w:rPr>
                               <w:t>EndDateCaption</w:t>
                             </w:r>
-                            <w:proofErr w:type="spellEnd"/>
                           </w:p>
                         </w:tc>
                       </w:sdtContent>
@@ -567,7 +594,6 @@
                                 <w:szCs w:val="16"/>
                               </w:rPr>
                             </w:pPr>
-                            <w:proofErr w:type="spellStart"/>
                             <w:r>
                               <w:rPr>
                                 <w:rFonts w:ascii="Segoe UI" w:hAnsi="Segoe UI" w:cs="Segoe UI"/>
@@ -576,7 +602,6 @@
                               </w:rPr>
                               <w:t>EndDate</w:t>
                             </w:r>
-                            <w:proofErr w:type="spellEnd"/>
                           </w:p>
                         </w:tc>
                       </w:sdtContent>
@@ -646,7 +671,6 @@
                                 <w:szCs w:val="18"/>
                               </w:rPr>
                             </w:pPr>
-                            <w:proofErr w:type="spellStart"/>
                             <w:r>
                               <w:rPr>
                                 <w:rFonts w:ascii="Segoe UI" w:hAnsi="Segoe UI" w:cs="Segoe UI"/>
@@ -655,7 +679,6 @@
                               </w:rPr>
                               <w:t>PostDate_DtldCustLedgEntriesCaption</w:t>
                             </w:r>
-                            <w:proofErr w:type="spellEnd"/>
                           </w:p>
                         </w:tc>
                       </w:sdtContent>
@@ -691,7 +714,6 @@
                                 <w:szCs w:val="18"/>
                               </w:rPr>
                             </w:pPr>
-                            <w:proofErr w:type="spellStart"/>
                             <w:r>
                               <w:rPr>
                                 <w:rFonts w:ascii="Segoe UI" w:hAnsi="Segoe UI" w:cs="Segoe UI"/>
@@ -700,7 +722,6 @@
                               </w:rPr>
                               <w:t>DocNo_DtldCustLedgEntriesCaption</w:t>
                             </w:r>
-                            <w:proofErr w:type="spellEnd"/>
                           </w:p>
                         </w:tc>
                       </w:sdtContent>
@@ -909,7 +930,6 @@
                                 <w:szCs w:val="18"/>
                               </w:rPr>
                             </w:pPr>
-                            <w:proofErr w:type="spellStart"/>
                             <w:r>
                               <w:rPr>
                                 <w:rFonts w:ascii="Segoe UI" w:hAnsi="Segoe UI" w:cs="Segoe UI"/>
@@ -918,7 +938,6 @@
                               </w:rPr>
                               <w:t>CustBalanceCaption</w:t>
                             </w:r>
-                            <w:proofErr w:type="spellEnd"/>
                           </w:p>
                         </w:tc>
                       </w:sdtContent>
@@ -1032,11 +1051,9 @@
                                     <w:text/>
                                   </w:sdtPr>
                                   <w:sdtContent>
-                                    <w:proofErr w:type="spellStart"/>
                                     <w:r>
                                       <w:t>StartBalance</w:t>
                                     </w:r>
-                                    <w:proofErr w:type="spellEnd"/>
                                   </w:sdtContent>
                                 </w:sdt>
                               </w:p>
@@ -1093,6 +1110,12 @@
                                         <w:dataBinding w:prefixMappings="xmlns:ns0='urn:microsoft-dynamics-nav/reports/Standard_Statement/1316/'" w:xpath="/ns0:NavWordReportXmlPart[1]/ns0:Customer[1]/ns0:Integer[1]/ns0:CurrencyLoop[1]/ns0:CustLedgEntryHdr[1]/ns0:DtldCustLedgEntries[1]/ns0:PostDate_DtldCustLedgEntries[1]" w:storeItemID="{6DA4901C-D430-4D4B-9017-1CE2DD1B612E}"/>
                                         <w:text/>
                                       </w:sdtPr>
+                                      <w:sdtEndPr>
+                                        <w:rPr>
+                                          <w:b/>
+                                          <w:bCs/>
+                                        </w:rPr>
+                                      </w:sdtEndPr>
                                       <w:sdtContent>
                                         <w:tc>
                                           <w:tcPr>
@@ -1109,7 +1132,6 @@
                                                 <w:szCs w:val="18"/>
                                               </w:rPr>
                                             </w:pPr>
-                                            <w:proofErr w:type="spellStart"/>
                                             <w:r>
                                               <w:rPr>
                                                 <w:rFonts w:ascii="Segoe UI" w:hAnsi="Segoe UI" w:cs="Segoe UI"/>
@@ -1119,7 +1141,6 @@
                                               </w:rPr>
                                               <w:t>PostDate_DtldCustLedgEntries</w:t>
                                             </w:r>
-                                            <w:proofErr w:type="spellEnd"/>
                                           </w:p>
                                         </w:tc>
                                       </w:sdtContent>
@@ -1242,7 +1263,6 @@
                                                 <w:szCs w:val="18"/>
                                               </w:rPr>
                                             </w:pPr>
-                                            <w:proofErr w:type="spellStart"/>
                                             <w:r>
                                               <w:rPr>
                                                 <w:rFonts w:ascii="Segoe UI" w:hAnsi="Segoe UI" w:cs="Segoe UI"/>
@@ -1251,7 +1271,6 @@
                                               </w:rPr>
                                               <w:t>DueDate_DtldCustLedgEntries</w:t>
                                             </w:r>
-                                            <w:proofErr w:type="spellEnd"/>
                                           </w:p>
                                         </w:tc>
                                       </w:sdtContent>
@@ -1287,7 +1306,6 @@
                                                 <w:szCs w:val="18"/>
                                               </w:rPr>
                                             </w:pPr>
-                                            <w:proofErr w:type="spellStart"/>
                                             <w:r>
                                               <w:rPr>
                                                 <w:rFonts w:ascii="Segoe UI" w:hAnsi="Segoe UI" w:cs="Segoe UI"/>
@@ -1296,7 +1314,6 @@
                                               </w:rPr>
                                               <w:t>Amt_DtldCustLedgEntries</w:t>
                                             </w:r>
-                                            <w:proofErr w:type="spellEnd"/>
                                           </w:p>
                                         </w:tc>
                                       </w:sdtContent>
@@ -1332,7 +1349,6 @@
                                                 <w:szCs w:val="18"/>
                                               </w:rPr>
                                             </w:pPr>
-                                            <w:proofErr w:type="spellStart"/>
                                             <w:r>
                                               <w:rPr>
                                                 <w:rFonts w:ascii="Segoe UI" w:hAnsi="Segoe UI" w:cs="Segoe UI"/>
@@ -1341,7 +1357,6 @@
                                               </w:rPr>
                                               <w:t>RemainAmt_DtldCustLedgEntries</w:t>
                                             </w:r>
-                                            <w:proofErr w:type="spellEnd"/>
                                           </w:p>
                                         </w:tc>
                                       </w:sdtContent>
@@ -1377,7 +1392,6 @@
                                                 <w:szCs w:val="18"/>
                                               </w:rPr>
                                             </w:pPr>
-                                            <w:proofErr w:type="spellStart"/>
                                             <w:r>
                                               <w:rPr>
                                                 <w:rFonts w:ascii="Segoe UI" w:hAnsi="Segoe UI" w:cs="Segoe UI"/>
@@ -1386,7 +1400,6 @@
                                               </w:rPr>
                                               <w:t>CustBalance</w:t>
                                             </w:r>
-                                            <w:proofErr w:type="spellEnd"/>
                                           </w:p>
                                         </w:tc>
                                       </w:sdtContent>
@@ -1433,7 +1446,6 @@
                                     <w15:dataBinding w:prefixMappings="xmlns:ns0='urn:microsoft-dynamics-nav/reports/Standard_Statement/1316/' " w:xpath="/ns0:NavWordReportXmlPart[1]/ns0:Customer[1]/ns0:Integer[1]/ns0:CurrencyLoop[1]/ns0:HSTCaption_CurrencyLoop[1]" w:storeItemID="{6DA4901C-D430-4D4B-9017-1CE2DD1B612E}"/>
                                   </w:sdtPr>
                                   <w:sdtContent>
-                                    <w:proofErr w:type="spellStart"/>
                                     <w:r>
                                       <w:rPr>
                                         <w:rFonts w:ascii="Segoe UI" w:hAnsi="Segoe UI" w:cs="Segoe UI"/>
@@ -1442,7 +1454,6 @@
                                       </w:rPr>
                                       <w:t>HSTCaption_CurrencyLoop</w:t>
                                     </w:r>
-                                    <w:proofErr w:type="spellEnd"/>
                                   </w:sdtContent>
                                 </w:sdt>
                                 <w:r>
@@ -1469,7 +1480,6 @@
                                     <w15:dataBinding w:prefixMappings="xmlns:ns0='urn:microsoft-dynamics-nav/reports/Standard_Statement/1316/' " w:xpath="/ns0:NavWordReportXmlPart[1]/ns0:Customer[1]/ns0:Integer[1]/ns0:CurrencyLoop[1]/ns0:totalTax_CurrencyLoop[1]" w:storeItemID="{6DA4901C-D430-4D4B-9017-1CE2DD1B612E}"/>
                                   </w:sdtPr>
                                   <w:sdtContent>
-                                    <w:proofErr w:type="spellStart"/>
                                     <w:r>
                                       <w:rPr>
                                         <w:rFonts w:ascii="Segoe UI" w:hAnsi="Segoe UI" w:cs="Segoe UI"/>
@@ -1478,7 +1488,6 @@
                                       </w:rPr>
                                       <w:t>totalTax_CurrencyLoop</w:t>
                                     </w:r>
-                                    <w:proofErr w:type="spellEnd"/>
                                   </w:sdtContent>
                                 </w:sdt>
                                 <w:r>
@@ -1651,7 +1660,6 @@
                                         <w:szCs w:val="18"/>
                                       </w:rPr>
                                     </w:pPr>
-                                    <w:proofErr w:type="spellStart"/>
                                     <w:r>
                                       <w:rPr>
                                         <w:rFonts w:ascii="Segoe UI" w:hAnsi="Segoe UI" w:cs="Segoe UI"/>
@@ -1661,7 +1669,6 @@
                                       </w:rPr>
                                       <w:t>CustBalance_CustLedgEntryHdrFooter</w:t>
                                     </w:r>
-                                    <w:proofErr w:type="spellEnd"/>
                                   </w:p>
                                 </w:tc>
                               </w:sdtContent>
@@ -1755,6 +1762,8 @@
                               </w:sdtPr>
                               <w:sdtEndPr>
                                 <w:rPr>
+                                  <w:b/>
+                                  <w:bCs/>
                                   <w:color w:val="FFFFFF" w:themeColor="background1"/>
                                 </w:rPr>
                               </w:sdtEndPr>
@@ -2113,12 +2122,6 @@
                                         <w:dataBinding w:prefixMappings="xmlns:ns0='urn:microsoft-dynamics-nav/reports/Standard_Statement/1316/'" w:xpath="/ns0:NavWordReportXmlPart[1]/ns0:Customer[1]/ns0:Integer[1]/ns0:CurrencyLoop[1]/ns0:OverdueVisible[1]/ns0:OverDueEntries[1]" w:storeItemID="{6DA4901C-D430-4D4B-9017-1CE2DD1B612E}"/>
                                         <w:text/>
                                       </w:sdtPr>
-                                      <w:sdtEndPr>
-                                        <w:rPr>
-                                          <w:b/>
-                                          <w:bCs/>
-                                        </w:rPr>
-                                      </w:sdtEndPr>
                                       <w:sdtContent>
                                         <w:tc>
                                           <w:tcPr>
@@ -2136,7 +2139,6 @@
                                                 <w:szCs w:val="18"/>
                                               </w:rPr>
                                             </w:pPr>
-                                            <w:proofErr w:type="spellStart"/>
                                             <w:r>
                                               <w:rPr>
                                                 <w:rFonts w:ascii="Segoe UI" w:hAnsi="Segoe UI" w:cs="Segoe UI"/>
@@ -2147,7 +2149,6 @@
                                               </w:rPr>
                                               <w:t>OverDueEntries</w:t>
                                             </w:r>
-                                            <w:proofErr w:type="spellEnd"/>
                                           </w:p>
                                         </w:tc>
                                       </w:sdtContent>
@@ -2204,6 +2205,12 @@
                                                 <w:dataBinding w:prefixMappings="xmlns:ns0='urn:microsoft-dynamics-nav/reports/Standard_Statement/1316/'" w:xpath="/ns0:NavWordReportXmlPart[1]/ns0:Customer[1]/ns0:Integer[1]/ns0:CurrencyLoop[1]/ns0:OverdueVisible[1]/ns0:CustLedgEntry2[1]/ns0:PostDate_CustLedgEntry2[1]" w:storeItemID="{6DA4901C-D430-4D4B-9017-1CE2DD1B612E}"/>
                                                 <w:text/>
                                               </w:sdtPr>
+                                              <w:sdtEndPr>
+                                                <w:rPr>
+                                                  <w:b/>
+                                                  <w:bCs/>
+                                                </w:rPr>
+                                              </w:sdtEndPr>
                                               <w:sdtContent>
                                                 <w:tc>
                                                   <w:tcPr>
@@ -2490,7 +2497,6 @@
                                             <w15:dataBinding w:prefixMappings="xmlns:ns0='urn:microsoft-dynamics-nav/reports/Standard_Statement/1316/' " w:xpath="/ns0:NavWordReportXmlPart[1]/ns0:Customer[1]/ns0:Integer[1]/ns0:CurrencyLoop[1]/ns0:OverdueVisible[1]/ns0:HSTCaptionIMT[1]" w:storeItemID="{6DA4901C-D430-4D4B-9017-1CE2DD1B612E}"/>
                                           </w:sdtPr>
                                           <w:sdtContent>
-                                            <w:proofErr w:type="spellStart"/>
                                             <w:r>
                                               <w:rPr>
                                                 <w:rFonts w:ascii="Segoe UI" w:hAnsi="Segoe UI" w:cs="Segoe UI"/>
@@ -2499,7 +2505,6 @@
                                               </w:rPr>
                                               <w:t>HSTCaptionIMT</w:t>
                                             </w:r>
-                                            <w:proofErr w:type="spellEnd"/>
                                           </w:sdtContent>
                                         </w:sdt>
                                         <w:r>
@@ -2526,7 +2531,6 @@
                                             <w15:dataBinding w:prefixMappings="xmlns:ns0='urn:microsoft-dynamics-nav/reports/Standard_Statement/1316/' " w:xpath="/ns0:NavWordReportXmlPart[1]/ns0:Customer[1]/ns0:Integer[1]/ns0:CurrencyLoop[1]/ns0:OverdueVisible[1]/ns0:totalTaxIMT[1]" w:storeItemID="{6DA4901C-D430-4D4B-9017-1CE2DD1B612E}"/>
                                           </w:sdtPr>
                                           <w:sdtContent>
-                                            <w:proofErr w:type="spellStart"/>
                                             <w:r>
                                               <w:rPr>
                                                 <w:rFonts w:ascii="Segoe UI" w:hAnsi="Segoe UI" w:cs="Segoe UI"/>
@@ -2535,7 +2539,6 @@
                                               </w:rPr>
                                               <w:t>totalTaxIMT</w:t>
                                             </w:r>
-                                            <w:proofErr w:type="spellEnd"/>
                                           </w:sdtContent>
                                         </w:sdt>
                                       </w:p>
@@ -2727,7 +2730,6 @@
                                                 <w:szCs w:val="18"/>
                                               </w:rPr>
                                             </w:pPr>
-                                            <w:proofErr w:type="spellStart"/>
                                             <w:r>
                                               <w:rPr>
                                                 <w:rFonts w:ascii="Segoe UI" w:hAnsi="Segoe UI" w:cs="Segoe UI"/>
@@ -2737,7 +2739,6 @@
                                               </w:rPr>
                                               <w:t>OverdueBalance</w:t>
                                             </w:r>
-                                            <w:proofErr w:type="spellEnd"/>
                                           </w:p>
                                         </w:tc>
                                       </w:sdtContent>
@@ -2814,7 +2815,6 @@
                                   <w:szCs w:val="18"/>
                                 </w:rPr>
                               </w:pPr>
-                              <w:proofErr w:type="spellStart"/>
                               <w:r>
                                 <w:rPr>
                                   <w:rFonts w:ascii="Segoe UI" w:hAnsi="Segoe UI" w:cs="Segoe UI"/>
@@ -2823,7 +2823,6 @@
                                 </w:rPr>
                                 <w:t>AgingBandEndingDate</w:t>
                               </w:r>
-                              <w:proofErr w:type="spellEnd"/>
                             </w:p>
                           </w:sdtContent>
                         </w:sdt>
@@ -3257,7 +3256,6 @@
                                         <w:szCs w:val="18"/>
                                       </w:rPr>
                                     </w:pPr>
-                                    <w:proofErr w:type="spellStart"/>
                                     <w:r>
                                       <w:rPr>
                                         <w:rFonts w:ascii="Segoe UI" w:hAnsi="Segoe UI" w:cs="Segoe UI"/>
@@ -3266,7 +3264,6 @@
                                       </w:rPr>
                                       <w:t>beforeCaption</w:t>
                                     </w:r>
-                                    <w:proofErr w:type="spellEnd"/>
                                   </w:p>
                                 </w:tc>
                               </w:sdtContent>
@@ -3330,12 +3327,6 @@
                                 <w:dataBinding w:prefixMappings="xmlns:ns0='urn:microsoft-dynamics-nav/reports/Standard_Statement/1316/'" w:xpath="/ns0:NavWordReportXmlPart[1]/ns0:Customer[1]/ns0:Integer[1]/ns0:AgingBandVisible[1]/ns0:AgingBandLoop[1]/ns0:AgingBandCurrencyCode[1]" w:storeItemID="{6DA4901C-D430-4D4B-9017-1CE2DD1B612E}"/>
                                 <w:text/>
                               </w:sdtPr>
-                              <w:sdtEndPr>
-                                <w:rPr>
-                                  <w:b/>
-                                  <w:bCs/>
-                                </w:rPr>
-                              </w:sdtEndPr>
                               <w:sdtContent>
                                 <w:tc>
                                   <w:tcPr>
@@ -3352,7 +3343,6 @@
                                         <w:szCs w:val="18"/>
                                       </w:rPr>
                                     </w:pPr>
-                                    <w:proofErr w:type="spellStart"/>
                                     <w:r>
                                       <w:rPr>
                                         <w:rFonts w:ascii="Segoe UI" w:hAnsi="Segoe UI" w:cs="Segoe UI"/>
@@ -3362,7 +3352,6 @@
                                       </w:rPr>
                                       <w:t>AgingBandCurrencyCode</w:t>
                                     </w:r>
-                                    <w:proofErr w:type="spellEnd"/>
                                   </w:p>
                                 </w:tc>
                               </w:sdtContent>
@@ -4243,7 +4232,6 @@
               <w:text/>
             </w:sdtPr>
             <w:sdtContent>
-              <w:proofErr w:type="spellStart"/>
               <w:r>
                 <w:rPr>
                   <w:rFonts w:ascii="Segoe UI" w:hAnsi="Segoe UI" w:cs="Segoe UI"/>
@@ -4253,7 +4241,6 @@
                 </w:rPr>
                 <w:t>PhoneNo_CompanyInfo</w:t>
               </w:r>
-              <w:proofErr w:type="spellEnd"/>
             </w:sdtContent>
           </w:sdt>
           <w:r>
@@ -4283,7 +4270,6 @@
               <w:text/>
             </w:sdtPr>
             <w:sdtContent>
-              <w:proofErr w:type="spellStart"/>
               <w:r>
                 <w:rPr>
                   <w:rFonts w:ascii="Segoe UI" w:hAnsi="Segoe UI" w:cs="Segoe UI"/>
@@ -4293,7 +4279,6 @@
                 </w:rPr>
                 <w:t>CompanyInfoEmail</w:t>
               </w:r>
-              <w:proofErr w:type="spellEnd"/>
             </w:sdtContent>
           </w:sdt>
         </w:p>
@@ -6060,6 +6045,7 @@
     <w:rsid w:val="00F34D36"/>
     <w:rsid w:val="00F65E13"/>
     <w:rsid w:val="00F67775"/>
+    <w:rsid w:val="00FE5C32"/>
     <w:rsid w:val="00FF00AB"/>
     <w:rsid w:val="00FF13F9"/>
     <w:rsid w:val="00FF4422"/>
@@ -6521,20 +6507,6 @@
       <w:color w:val="808080"/>
     </w:rPr>
   </w:style>
-  <w:style w:type="paragraph" w:customStyle="1" w:styleId="BA05112201474B51A9A00E69C9396407">
-    <w:name w:val="BA05112201474B51A9A00E69C9396407"/>
-    <w:rsid w:val="00B53F77"/>
-    <w:pPr>
-      <w:spacing w:line="278" w:lineRule="auto"/>
-    </w:pPr>
-    <w:rPr>
-      <w:kern w:val="2"/>
-      <w:sz w:val="24"/>
-      <w:szCs w:val="24"/>
-      <w:lang w:val="en-CA" w:eastAsia="en-CA"/>
-      <w14:ligatures w14:val="standardContextual"/>
-    </w:rPr>
-  </w:style>
   <w:style w:type="paragraph" w:customStyle="1" w:styleId="855D4422C7114360A0F59F2144FCEB74">
     <w:name w:val="855D4422C7114360A0F59F2144FCEB74"/>
     <w:rsid w:val="009C1F09"/>
@@ -6604,20 +6576,6 @@
   <w:style w:type="paragraph" w:customStyle="1" w:styleId="781FB13D53534CB3A86CEB1ABC62DE4F">
     <w:name w:val="781FB13D53534CB3A86CEB1ABC62DE4F"/>
     <w:rsid w:val="001B4D32"/>
-    <w:pPr>
-      <w:spacing w:line="278" w:lineRule="auto"/>
-    </w:pPr>
-    <w:rPr>
-      <w:kern w:val="2"/>
-      <w:sz w:val="24"/>
-      <w:szCs w:val="24"/>
-      <w:lang w:val="en-CA" w:eastAsia="en-CA"/>
-      <w14:ligatures w14:val="standardContextual"/>
-    </w:rPr>
-  </w:style>
-  <w:style w:type="paragraph" w:customStyle="1" w:styleId="5C933E47565447EE887CBD9C72858DF4">
-    <w:name w:val="5C933E47565447EE887CBD9C72858DF4"/>
-    <w:rsid w:val="00B53F77"/>
     <w:pPr>
       <w:spacing w:line="278" w:lineRule="auto"/>
     </w:pPr>
@@ -6901,7 +6859,13 @@
 </a:theme>
 </file>
 
-<file path=customXml/item1.xml>��< ? x m l   v e r s i o n = " 1 . 0 "   e n c o d i n g = " u t f - 1 6 " ? > < N a v W o r d R e p o r t X m l P a r t   x m l n s = " u r n : m i c r o s o f t - d y n a m i c s - b u s i n e s s c e n t r a l / i n t e r n a l / e x t e n d e d / r e p o r t s / S t a n d a r d _ S t a t e m e n t / 1 3 1 6 / " > +<file path=customXml/item1.xml><?xml version="1.0" encoding="utf-8"?>
+<b:Sources xmlns:b="http://schemas.openxmlformats.org/officeDocument/2006/bibliography" xmlns="http://schemas.openxmlformats.org/officeDocument/2006/bibliography" SelectedStyle="\apasixtheditionofficeonline.xsl" StyleName="APA" Version="6"/>
+</file>
+
+<file path=customXml/item2.xml>��< ? x m l   v e r s i o n = " 1 . 0 "   e n c o d i n g = " u t f - 1 6 " ? > + 
+ < N a v W o r d R e p o r t X m l P a r t   x m l n s = " u r n : m i c r o s o f t - d y n a m i c s - n a v / r e p o r t s / S t a n d a r d _ S t a t e m e n t / 1 3 1 6 / " >   
      < B C R e p o r t I n f o r m a t i o n >   
@@ -6967,249 +6931,247 @@
  
      < / B C R e p o r t I n f o r m a t i o n >   
-     < T o o l t i p s / > - 
-     < C u s t o m e r   E l e m e n t T y p e = " D a t a I t e m "   E l e m e n t I d = " 1 5 2 5 1 9 1 9 9 " > - 
-         < C F S C u s t A d d r e s s 1   E l e m e n t T y p e = " C o l u m n "   E l e m e n t I d = " 1 0 1 0 7 4 5 6 2 7 "   D a t a T y p e = " T e x t " > C F S C u s t A d d r e s s 1 < / C F S C u s t A d d r e s s 1 > - 
-         < C F S C u s t A d d r e s s 2   E l e m e n t T y p e = " C o l u m n "   E l e m e n t I d = " 3 7 3 0 4 9 0 1 0 "   D a t a T y p e = " T e x t " > C F S C u s t A d d r e s s 2 < / C F S C u s t A d d r e s s 2 > - 
-         < C F S C u s t A d d r e s s 3   E l e m e n t T y p e = " C o l u m n "   E l e m e n t I d = " 2 6 4 6 4 7 6 0 7 "   D a t a T y p e = " T e x t " > C F S C u s t A d d r e s s 3 < / C F S C u s t A d d r e s s 3 > - 
-         < C F S C u s t A d d r e s s 4   E l e m e n t T y p e = " C o l u m n "   E l e m e n t I d = " 9 5 7 3 8 5 8 4 "   D a t a T y p e = " T e x t " > C F S C u s t A d d r e s s 4 < / C F S C u s t A d d r e s s 4 > - 
-         < C F S C u s t A d d r e s s 5   E l e m e n t T y p e = " C o l u m n "   E l e m e n t I d = " 7 3 3 4 3 5 2 0 1 "   D a t a T y p e = " T e x t " > C F S C u s t A d d r e s s 5 < / C F S C u s t A d d r e s s 5 > - 
-         < C F S C u s t A d d r e s s 6   E l e m e n t T y p e = " C o l u m n "   E l e m e n t I d = " 1 3 7 1 1 3 1 8 1 8 "   D a t a T y p e = " T e x t " > C F S C u s t A d d r e s s 6 < / C F S C u s t A d d r e s s 6 > - 
-         < C F S C u s t A d d r e s s 7   E l e m e n t T y p e = " C o l u m n "   E l e m e n t I d = " 2 0 0 8 8 2 8 4 3 5 "   D a t a T y p e = " T e x t " > C F S C u s t A d d r e s s 7 < / C F S C u s t A d d r e s s 7 > - 
-         < C F S C u s t A d d r e s s 8   E l e m e n t T y p e = " C o l u m n "   E l e m e n t I d = " 1 8 3 9 9 1 9 4 1 2 "   D a t a T y p e = " T e x t " > C F S C u s t A d d r e s s 8 < / C F S C u s t A d d r e s s 8 > - 
-         < N o _ C u s t   E l e m e n t T y p e = " C o l u m n "   E l e m e n t I d = " 6 0 3 9 7 0 8 4 6 "   D a t a T y p e = " C o d e " > N o _ C u s t < / N o _ C u s t > - 
-         < I n t e g e r   E l e m e n t T y p e = " D a t a I t e m "   E l e m e n t I d = " 1 7 3 5 6 9 8 6 1 9 " > - 
-             < B a n k A c c N o _ C o m p a n y I n f o   E l e m e n t T y p e = " C o l u m n "   E l e m e n t I d = " 8 6 4 5 4 5 9 0 7 "   D a t a T y p e = " T e x t " > B a n k A c c N o _ C o m p a n y I n f o < / B a n k A c c N o _ C o m p a n y I n f o > - 
-             < B a n k A c c N o _ C o m p a n y I n f o C a p t i o n   E l e m e n t T y p e = " C o l u m n "   E l e m e n t I d = " 1 9 1 8 8 5 3 8 1 3 "   D a t a T y p e = " L a b e l " > B a n k A c c N o _ C o m p a n y I n f o C a p t i o n < / B a n k A c c N o _ C o m p a n y I n f o C a p t i o n > - 
-             < B a n k N a m e _ C o m p a n y I n f o   E l e m e n t T y p e = " C o l u m n "   E l e m e n t I d = " 1 9 1 7 2 0 2 0 4 2 "   D a t a T y p e = " T e x t " > B a n k N a m e _ C o m p a n y I n f o < / B a n k N a m e _ C o m p a n y I n f o > - 
-             < B a n k N a m e _ C o m p a n y I n f o C a p t i o n   E l e m e n t T y p e = " C o l u m n "   E l e m e n t I d = " 1 6 0 4 3 0 7 5 8 8 "   D a t a T y p e = " L a b e l " > B a n k N a m e _ C o m p a n y I n f o C a p t i o n < / B a n k N a m e _ C o m p a n y I n f o C a p t i o n > - 
-             < C o m p a n y A d d r 1   E l e m e n t T y p e = " C o l u m n "   E l e m e n t I d = " 8 8 5 0 9 6 1 0 4 "   D a t a T y p e = " T e x t " > C o m p a n y A d d r 1 < / C o m p a n y A d d r 1 > - 
-             < C o m p a n y A d d r 2   E l e m e n t T y p e = " C o l u m n "   E l e m e n t I d = " 1 0 2 7 9 9 3 7 4 7 "   D a t a T y p e = " T e x t " > C o m p a n y A d d r 2 < / C o m p a n y A d d r 2 > - 
-             < C o m p a n y A d d r 3   E l e m e n t T y p e = " C o l u m n "   E l e m e n t I d = " 3 9 0 2 9 7 1 3 0 "   D a t a T y p e = " T e x t " > C o m p a n y A d d r 3 < / C o m p a n y A d d r 3 > - 
-             < C o m p a n y A d d r 4   E l e m e n t T y p e = " C o l u m n "   E l e m e n t I d = " 1 9 9 1 5 8 0 3 1 5 "   D a t a T y p e = " T e x t " > C o m p a n y A d d r 4 < / C o m p a n y A d d r 4 > - 
-             < C o m p a n y A d d r 5   E l e m e n t T y p e = " C o l u m n "   E l e m e n t I d = " 1 6 6 5 6 9 0 3 6 4 "   D a t a T y p e = " T e x t " > C o m p a n y A d d r 5 < / C o m p a n y A d d r 5 > - 
-             < C o m p a n y A d d r 6   E l e m e n t T y p e = " C o l u m n "   E l e m e n t I d = " 7 1 6 1 8 7 0 8 1 "   D a t a T y p e = " T e x t " > C o m p a n y A d d r 6 < / C o m p a n y A d d r 6 > - 
-             < C o m p a n y A d d r 7   E l e m e n t T y p e = " C o l u m n "   E l e m e n t I d = " 1 3 5 3 8 8 3 6 9 8 "   D a t a T y p e = " T e x t " > C o m p a n y A d d r 7 < / C o m p a n y A d d r 7 > - 
-             < C o m p a n y A d d r 8   E l e m e n t T y p e = " C o l u m n "   E l e m e n t I d = " 1 0 5 4 0 0 5 1 2 7 "   D a t a T y p e = " T e x t " > C o m p a n y A d d r 8 < / C o m p a n y A d d r 8 > - 
-             < C o m p a n y I n f o 1 P i c t u r e   E l e m e n t T y p e = " C o l u m n "   E l e m e n t I d = " 1 0 1 8 2 0 6 5 0 3 "   D a t a T y p e = " B l o b " / > - 
-             < C o m p a n y I n f o 2 P i c t u r e   E l e m e n t T y p e = " C o l u m n "   E l e m e n t I d = " 9 8 9 6 7 0 4 7 4 "   D a t a T y p e = " B l o b " / > - 
-             < C o m p a n y I n f o 3 P i c t u r e   E l e m e n t T y p e = " C o l u m n "   E l e m e n t I d = " 5 7 9 7 0 4 0 5 9 "   D a t a T y p e = " B l o b " / > - 
-             < C o m p a n y I n f o E m a i l   E l e m e n t T y p e = " C o l u m n "   E l e m e n t I d = " 9 1 4 8 1 2 2 4 0 "   D a t a T y p e = " T e x t " > C o m p a n y I n f o E m a i l < / C o m p a n y I n f o E m a i l > - 
-             < C o m p a n y I n f o E m a i l C a p t i o n   E l e m e n t T y p e = " C o l u m n "   E l e m e n t I d = " 1 5 5 2 1 6 7 2 3 0 "   D a t a T y p e = " L a b e l " > C o m p a n y I n f o E m a i l C a p t i o n < / C o m p a n y I n f o E m a i l C a p t i o n > - 
-             < C o m p a n y I n f o H o m e P a g e   E l e m e n t T y p e = " C o l u m n "   E l e m e n t I d = " 1 5 3 0 3 1 7 4 4 0 "   D a t a T y p e = " T e x t " > C o m p a n y I n f o H o m e P a g e < / C o m p a n y I n f o H o m e P a g e > - 
-             < C o m p a n y I n f o H o m e p a g e C a p t i o n   E l e m e n t T y p e = " C o l u m n "   E l e m e n t I d = " 1 5 2 9 8 2 3 8 6 "   D a t a T y p e = " L a b e l " > C o m p a n y I n f o H o m e p a g e C a p t i o n < / C o m p a n y I n f o H o m e p a g e C a p t i o n > - 
-             < C o m p a n y L e g a l O f f i c e   E l e m e n t T y p e = " C o l u m n "   E l e m e n t I d = " 7 1 4 2 5 8 1 1 1 "   D a t a T y p e = " T e x t " > C o m p a n y L e g a l O f f i c e < / C o m p a n y L e g a l O f f i c e > - 
-             < C o m p a n y L e g a l O f f i c e _ L b l   E l e m e n t T y p e = " C o l u m n "   E l e m e n t I d = " 1 5 3 3 1 7 5 1 0 8 "   D a t a T y p e = " T e x t " > C o m p a n y L e g a l O f f i c e _ L b l < / C o m p a n y L e g a l O f f i c e _ L b l > - 
-             < C o m p a n y P i c t u r e   E l e m e n t T y p e = " C o l u m n "   E l e m e n t I d = " 1 3 9 7 4 1 1 0 7 4 "   D a t a T y p e = " B l o b " / > - 
-             < C u r r R e p o r t P a g e N o C a p t i o n   E l e m e n t T y p e = " C o l u m n "   E l e m e n t I d = " 2 0 2 2 2 2 5 3 5 1 "   D a t a T y p e = " L a b e l " > C u r r R e p o r t P a g e N o C a p t i o n < / C u r r R e p o r t P a g e N o C a p t i o n > - 
-             < C u s t A d d r 1   E l e m e n t T y p e = " C o l u m n "   E l e m e n t I d = " 1 3 6 8 0 2 7 5 2 2 "   D a t a T y p e = " T e x t " > C u s t A d d r 1 < / C u s t A d d r 1 > - 
-             < C u s t A d d r 2   E l e m e n t T y p e = " C o l u m n "   E l e m e n t I d = " 2 0 0 5 7 2 4 1 3 9 "   D a t a T y p e = " T e x t " > C u s t A d d r 2 < / C u s t A d d r 2 > - 
-             < C u s t A d d r 3   E l e m e n t T y p e = " C o l u m n "   E l e m e n t I d = " 1 6 5 1 5 4 6 5 4 0 "   D a t a T y p e = " T e x t " > C u s t A d d r 3 < / C u s t A d d r 3 > - 
-             < C u s t A d d r 4   E l e m e n t T y p e = " C o l u m n "   E l e m e n t I d = " 1 0 1 3 8 4 9 9 2 3 "   D a t a T y p e = " T e x t " > C u s t A d d r 4 < / C u s t A d d r 4 > - 
-             < C u s t A d d r 5   E l e m e n t T y p e = " C o l u m n "   E l e m e n t I d = " 3 7 6 1 5 3 3 0 6 "   D a t a T y p e = " T e x t " > C u s t A d d r 5 < / C u s t A d d r 5 > - 
-             < C u s t A d d r 6   E l e m e n t T y p e = " C o l u m n "   E l e m e n t I d = " 2 6 1 5 4 3 3 1 1 "   D a t a T y p e = " T e x t " > C u s t A d d r 6 < / C u s t A d d r 6 > - 
-             < C u s t A d d r 7   E l e m e n t T y p e = " C o l u m n "   E l e m e n t I d = " 8 9 9 2 3 9 9 2 8 "   D a t a T y p e = " T e x t " > C u s t A d d r 7 < / C u s t A d d r 7 > - 
-             < C u s t A d d r 8   E l e m e n t T y p e = " C o l u m n "   E l e m e n t I d = " 1 5 3 6 9 3 6 5 4 5 "   D a t a T y p e = " T e x t " > C u s t A d d r 8 < / C u s t A d d r 8 > - 
-             < C u s t B a l a n c e C a p t i o n   E l e m e n t T y p e = " C o l u m n "   E l e m e n t I d = " 6 0 8 6 6 1 8 8 4 "   D a t a T y p e = " L a b e l " > C u s t B a l a n c e C a p t i o n < / C u s t B a l a n c e C a p t i o n > - 
-             < D e s c _ C u s t L e d g E n t r y 2 C a p t i o n   E l e m e n t T y p e = " C o l u m n "   E l e m e n t I d = " 1 8 7 4 4 3 7 6 7 2 "   D a t a T y p e = " S t r i n g " > D e s c _ C u s t L e d g E n t r y 2 C a p t i o n < / D e s c _ C u s t L e d g E n t r y 2 C a p t i o n > - 
-             < D o c D a t e C a p t i o n   E l e m e n t T y p e = " C o l u m n "   E l e m e n t I d = " 1 1 5 7 6 2 1 5 3 7 "   D a t a T y p e = " L a b e l " > D o c D a t e C a p t i o n < / D o c D a t e C a p t i o n > - 
-             < D o c N o _ D t l d C u s t L e d g E n t r i e s C a p t i o n   E l e m e n t T y p e = " C o l u m n "   E l e m e n t I d = " 6 0 1 5 1 5 5 5 6 "   D a t a T y p e = " S t r i n g " > D o c N o _ D t l d C u s t L e d g E n t r i e s C a p t i o n < / D o c N o _ D t l d C u s t L e d g E n t r i e s C a p t i o n > - 
-             < D u e D a t e _ C u s t L e d g E n t r y 2 C a p t i o n   E l e m e n t T y p e = " C o l u m n "   E l e m e n t I d = " 8 1 9 2 8 5 8 5 "   D a t a T y p e = " L a b e l " > D u e D a t e _ C u s t L e d g E n t r y 2 C a p t i o n < / D u e D a t e _ C u s t L e d g E n t r y 2 C a p t i o n > - 
-             < E n d D a t e   E l e m e n t T y p e = " C o l u m n "   E l e m e n t I d = " 1 3 0 2 0 8 2 6 1 0 "   D a t a T y p e = " S t r i n g " > E n d D a t e < / E n d D a t e > - 
-             < E n d D a t e C a p t i o n   E l e m e n t T y p e = " C o l u m n "   E l e m e n t I d = " 1 3 5 3 1 9 2 8 0 "   D a t a T y p e = " L a b e l " > E n d D a t e C a p t i o n < / E n d D a t e C a p t i o n > - 
-             < G i r o N o _ C o m p a n y I n f o   E l e m e n t T y p e = " C o l u m n "   E l e m e n t I d = " 5 6 5 4 8 5 5 1 9 "   D a t a T y p e = " T e x t " > G i r o N o _ C o m p a n y I n f o < / G i r o N o _ C o m p a n y I n f o > - 
-             < G i r o N o _ C o m p a n y I n f o C a p t i o n   E l e m e n t T y p e = " C o l u m n "   E l e m e n t I d = " 1 6 5 8 5 3 3 3 6 9 "   D a t a T y p e = " L a b e l " > G i r o N o _ C o m p a n y I n f o C a p t i o n < / G i r o N o _ C o m p a n y I n f o C a p t i o n > - 
-             < L a s t S t a t m n t N o _ C u s t   E l e m e n t T y p e = " C o l u m n "   E l e m e n t I d = " 1 3 8 8 0 8 0 0 2 9 "   D a t a T y p e = " S t r i n g " > L a s t S t a t m n t N o _ C u s t < / L a s t S t a t m n t N o _ C u s t > - 
-             < L a s t S t a t m n t N o _ C u s t C a p t i o n   E l e m e n t T y p e = " C o l u m n "   E l e m e n t I d = " 8 9 2 5 6 7 8 3 5 "   D a t a T y p e = " L a b e l " > L a s t S t a t m n t N o _ C u s t C a p t i o n < / L a s t S t a t m n t N o _ C u s t C a p t i o n > - 
-             < N o 1 _ C u s t   E l e m e n t T y p e = " C o l u m n "   E l e m e n t I d = " 9 1 2 7 7 0 5 0 9 "   D a t a T y p e = " C o d e " > N o 1 _ C u s t < / N o 1 _ C u s t > - 
-             < N o 1 _ C u s t C a p t i o n   E l e m e n t T y p e = " C o l u m n "   E l e m e n t I d = " 1 6 6 1 8 9 3 3 9 7 "   D a t a T y p e = " L a b e l " > N o 1 _ C u s t C a p t i o n < / N o 1 _ C u s t C a p t i o n > - 
-             < O r i g i n a l A m t _ C u s t L e d g E n t r y 2 C a p t i o n   E l e m e n t T y p e = " C o l u m n "   E l e m e n t I d = " 8 4 8 8 4 4 3 9 2 "   D a t a T y p e = " S t r i n g " > O r i g i n a l A m t _ C u s t L e d g E n t r y 2 C a p t i o n < / O r i g i n a l A m t _ C u s t L e d g E n t r y 2 C a p t i o n > - 
-             < P h o n e N o _ C o m p a n y I n f o   E l e m e n t T y p e = " C o l u m n "   E l e m e n t I d = " 1 6 0 6 4 2 8 3 9 4 "   D a t a T y p e = " T e x t " > P h o n e N o _ C o m p a n y I n f o < / P h o n e N o _ C o m p a n y I n f o > - 
-             < P h o n e N o _ C o m p a n y I n f o C a p t i o n   E l e m e n t T y p e = " C o l u m n "   E l e m e n t I d = " 1 8 7 6 0 4 7 7 0 4 "   D a t a T y p e = " L a b e l " > P h o n e N o _ C o m p a n y I n f o C a p t i o n < / P h o n e N o _ C o m p a n y I n f o C a p t i o n > - 
-             < P o s t D a t e _ D t l d C u s t L e d g E n t r i e s C a p t i o n   E l e m e n t T y p e = " C o l u m n "   E l e m e n t I d = " 1 0 3 3 1 2 5 4 2 5 "   D a t a T y p e = " L a b e l " > P o s t D a t e _ D t l d C u s t L e d g E n t r i e s C a p t i o n < / P o s t D a t e _ D t l d C u s t L e d g E n t r i e s C a p t i o n > - 
-             < R e m a i n A m t C u s t L e d g E n t r y 2 C a p t i o n   E l e m e n t T y p e = " C o l u m n "   E l e m e n t I d = " 1 6 3 2 7 0 6 4 0 6 "   D a t a T y p e = " S t r i n g " > R e m a i n A m t C u s t L e d g E n t r y 2 C a p t i o n < / R e m a i n A m t C u s t L e d g E n t r y 2 C a p t i o n > - 
-             < S t a r t D a t e   E l e m e n t T y p e = " C o l u m n "   E l e m e n t I d = " 1 4 5 7 6 6 9 4 1 7 "   D a t a T y p e = " S t r i n g " > S t a r t D a t e < / S t a r t D a t e > - 
-             < S t a r t D a t e C a p t i o n   E l e m e n t T y p e = " C o l u m n "   E l e m e n t I d = " 1 9 8 0 7 4 5 8 7 1 "   D a t a T y p e = " L a b e l " > S t a r t D a t e C a p t i o n < / S t a r t D a t e C a p t i o n > - 
-             < S t a t e m e n t C a p t i o n   E l e m e n t T y p e = " C o l u m n "   E l e m e n t I d = " 2 3 9 3 8 2 "   D a t a T y p e = " L a b e l " > S t a t e m e n t C a p t i o n < / S t a t e m e n t C a p t i o n > - 
-             < T o d a y F o r m a t t e d   E l e m e n t T y p e = " C o l u m n "   E l e m e n t I d = " 2 7 0 4 5 1 4 0 "   D a t a T y p e = " S t r i n g " > T o d a y F o r m a t t e d < / T o d a y F o r m a t t e d > - 
-             < V A T R e g N o _ C o m p a n y I n f o   E l e m e n t T y p e = " C o l u m n "   E l e m e n t I d = " 9 4 4 0 2 9 3 7 7 "   D a t a T y p e = " T e x t " > V A T R e g N o _ C o m p a n y I n f o < / V A T R e g N o _ C o m p a n y I n f o > - 
-             < V A T R e g N o _ C o m p a n y I n f o C a p t i o n   E l e m e n t T y p e = " C o l u m n "   E l e m e n t I d = " 1 1 9 3 2 7 6 3 7 5 "   D a t a T y p e = " L a b e l " > V A T R e g N o _ C o m p a n y I n f o C a p t i o n < / V A T R e g N o _ C o m p a n y I n f o C a p t i o n > - 
-             < C u r r e n c y L o o p   E l e m e n t T y p e = " D a t a I t e m "   E l e m e n t I d = " 1 3 0 4 5 2 2 1 9 8 " > - 
-                 < T o t a l _ C a p t i o n 2   E l e m e n t T y p e = " C o l u m n "   E l e m e n t I d = " 1 9 9 1 3 0 2 6 0 "   D a t a T y p e = " L a b e l " > T o t a l _ C a p t i o n 2 < / T o t a l _ C a p t i o n 2 > - 
-                 < C u s t L e d g E n t r y H d r   E l e m e n t T y p e = " D a t a I t e m "   E l e m e n t I d = " 9 4 2 7 0 7 9 3 2 " > - 
-                     < C u r r e n c y 2 C o d e _ C u s t L e d g E n t r y H d r   E l e m e n t T y p e = " C o l u m n "   E l e m e n t I d = " 1 3 4 9 2 7 9 6 1 1 "   D a t a T y p e = " S t r i n g " > C u r r e n c y 2 C o d e _ C u s t L e d g E n t r y H d r < / C u r r e n c y 2 C o d e _ C u s t L e d g E n t r y H d r > - 
-                     < C u r r e n c y C o d e 3   E l e m e n t T y p e = " C o l u m n "   E l e m e n t I d = " 6 1 8 1 4 2 9 0 8 "   D a t a T y p e = " C o d e " > C u r r e n c y C o d e 3 < / C u r r e n c y C o d e 3 > - 
-                     < C u s t B a l a n c e _ C u s t L e d g E n t r y H d r   E l e m e n t T y p e = " C o l u m n "   E l e m e n t I d = " 4 9 7 1 9 1 3 5 6 "   D a t a T y p e = " D e c i m a l " > C u s t B a l a n c e _ C u s t L e d g E n t r y H d r < / C u s t B a l a n c e _ C u s t L e d g E n t r y H d r > - 
-                     < D t l d C u s t L e d g E n t r y T y p e   E l e m e n t T y p e = " C o l u m n "   E l e m e n t I d = " 8 9 2 0 6 7 4 8 6 "   D a t a T y p e = " S t r i n g " > D t l d C u s t L e d g E n t r y T y p e < / D t l d C u s t L e d g E n t r y T y p e > - 
-                     < E n t r i e s E x i s t s   E l e m e n t T y p e = " C o l u m n "   E l e m e n t I d = " 1 8 9 9 2 2 0 4 1 "   D a t a T y p e = " B o o l e a n " > E n t r i e s E x i s t s < / E n t r i e s E x i s t s > - 
-                     < I s N e w C u s t C u r r e n c y G r o u p   E l e m e n t T y p e = " C o l u m n "   E l e m e n t I d = " 1 1 6 2 5 3 5 5 3 8 "   D a t a T y p e = " B o o l e a n " > I s N e w C u s t C u r r e n c y G r o u p < / I s N e w C u s t C u r r e n c y G r o u p > - 
-                     < P r i n t L i n e   E l e m e n t T y p e = " C o l u m n "   E l e m e n t I d = " 5 9 8 4 7 9 9 9 0 "   D a t a T y p e = " B o o l e a n " > P r i n t L i n e < / P r i n t L i n e > - 
-                     < S t a r t B a l a n c e   E l e m e n t T y p e = " C o l u m n "   E l e m e n t I d = " 3 2 9 4 8 3 5 7 9 "   D a t a T y p e = " D e c i m a l " > S t a r t B a l a n c e < / S t a r t B a l a n c e > - 
-                     < D t l d C u s t L e d g E n t r i e s   E l e m e n t T y p e = " D a t a I t e m "   E l e m e n t I d = " 1 1 1 1 4 6 3 1 7 2 " > - 
-                         < A m t _ D t l d C u s t L e d g E n t r i e s   E l e m e n t T y p e = " C o l u m n "   E l e m e n t I d = " 8 9 7 9 8 5 1 7 9 "   D a t a T y p e = " D e c i m a l " > A m t _ D t l d C u s t L e d g E n t r i e s < / A m t _ D t l d C u s t L e d g E n t r i e s > - 
-                         < C u r r C o d e _ D t l d C u s t L e d g E n t r i e s   E l e m e n t T y p e = " C o l u m n "   E l e m e n t I d = " 3 2 7 0 9 9 9 8 4 "   D a t a T y p e = " C o d e " > C u r r C o d e _ D t l d C u s t L e d g E n t r i e s < / C u r r C o d e _ D t l d C u s t L e d g E n t r i e s > - 
-                         < C u r r e n c y 2 C o d e   E l e m e n t T y p e = " C o l u m n "   E l e m e n t I d = " 4 6 5 9 9 3 8 2 7 "   D a t a T y p e = " C o d e " > C u r r e n c y 2 C o d e < / C u r r e n c y 2 C o d e > - 
-                         < C u s t B a l a n c e   E l e m e n t T y p e = " C o l u m n "   E l e m e n t I d = " 1 4 1 3 7 0 1 5 0 2 "   D a t a T y p e = " D e c i m a l " > C u s t B a l a n c e < / C u s t B a l a n c e > - 
-                         < D e s c r i p t i o n   E l e m e n t T y p e = " C o l u m n "   E l e m e n t I d = " 1 3 1 4 3 5 1 3 0 7 "   D a t a T y p e = " T e x t " > D e s c r i p t i o n < / D e s c r i p t i o n > - 
-                         < D o c N o _ D t l d C u s t L e d g E n t r i e s   E l e m e n t T y p e = " C o l u m n "   E l e m e n t I d = " 2 2 4 2 9 8 6 5 4 "   D a t a T y p e = " C o d e " > D o c N o _ D t l d C u s t L e d g E n t r i e s < / D o c N o _ D t l d C u s t L e d g E n t r i e s > - 
-                         < D u e D a t e _ D t l d C u s t L e d g E n t r i e s   E l e m e n t T y p e = " C o l u m n "   E l e m e n t I d = " 1 4 1 7 8 6 1 6 0 3 "   D a t a T y p e = " S t r i n g " > D u e D a t e _ D t l d C u s t L e d g E n t r i e s < / D u e D a t e _ D t l d C u s t L e d g E n t r i e s > - 
-                         < P o s t D a t e _ D t l d C u s t L e d g E n t r i e s   E l e m e n t T y p e = " C o l u m n "   E l e m e n t I d = " 1 6 8 8 2 9 9 9 1 3 "   D a t a T y p e = " S t r i n g " > P o s t D a t e _ D t l d C u s t L e d g E n t r i e s < / P o s t D a t e _ D t l d C u s t L e d g E n t r i e s > - 
-                         < R e m a i n A m t _ D t l d C u s t L e d g E n t r i e s   E l e m e n t T y p e = " C o l u m n "   E l e m e n t I d = " 1 4 5 7 2 4 8 8 2 5 "   D a t a T y p e = " D e c i m a l " > R e m a i n A m t _ D t l d C u s t L e d g E n t r i e s < / R e m a i n A m t _ D t l d C u s t L e d g E n t r i e s > - 
-                         < Y o u r R e f e r e n c e _ D t l d C u s t L e d g E n t r i e s   E l e m e n t T y p e = " C o l u m n "   E l e m e n t I d = " 6 7 5 1 3 6 1 6 7 "   D a t a T y p e = " T e x t " > Y o u r R e f e r e n c e _ D t l d C u s t L e d g E n t r i e s < / Y o u r R e f e r e n c e _ D t l d C u s t L e d g E n t r i e s > +     < C u s t o m e r > + 
+         < C F S C u s t A d d r e s s 1 > C F S C u s t A d d r e s s 1 < / C F S C u s t A d d r e s s 1 > + 
+         < C F S C u s t A d d r e s s 2 > C F S C u s t A d d r e s s 2 < / C F S C u s t A d d r e s s 2 > + 
+         < C F S C u s t A d d r e s s 3 > C F S C u s t A d d r e s s 3 < / C F S C u s t A d d r e s s 3 > + 
+         < C F S C u s t A d d r e s s 4 > C F S C u s t A d d r e s s 4 < / C F S C u s t A d d r e s s 4 > + 
+         < C F S C u s t A d d r e s s 5 > C F S C u s t A d d r e s s 5 < / C F S C u s t A d d r e s s 5 > + 
+         < C F S C u s t A d d r e s s 6 > C F S C u s t A d d r e s s 6 < / C F S C u s t A d d r e s s 6 > + 
+         < C F S C u s t A d d r e s s 7 > C F S C u s t A d d r e s s 7 < / C F S C u s t A d d r e s s 7 > + 
+         < C F S C u s t A d d r e s s 8 > C F S C u s t A d d r e s s 8 < / C F S C u s t A d d r e s s 8 > + 
+         < N o _ C u s t > N o _ C u s t < / N o _ C u s t > + 
+         < I n t e g e r > + 
+             < B a n k A c c N o _ C o m p a n y I n f o > B a n k A c c N o _ C o m p a n y I n f o < / B a n k A c c N o _ C o m p a n y I n f o > + 
+             < B a n k A c c N o _ C o m p a n y I n f o C a p t i o n > B a n k A c c N o _ C o m p a n y I n f o C a p t i o n < / B a n k A c c N o _ C o m p a n y I n f o C a p t i o n > + 
+             < B a n k N a m e _ C o m p a n y I n f o > B a n k N a m e _ C o m p a n y I n f o < / B a n k N a m e _ C o m p a n y I n f o > + 
+             < B a n k N a m e _ C o m p a n y I n f o C a p t i o n > B a n k N a m e _ C o m p a n y I n f o C a p t i o n < / B a n k N a m e _ C o m p a n y I n f o C a p t i o n > + 
+             < C o m p a n y A d d r 1 > C o m p a n y A d d r 1 < / C o m p a n y A d d r 1 > + 
+             < C o m p a n y A d d r 2 > C o m p a n y A d d r 2 < / C o m p a n y A d d r 2 > + 
+             < C o m p a n y A d d r 3 > C o m p a n y A d d r 3 < / C o m p a n y A d d r 3 > + 
+             < C o m p a n y A d d r 4 > C o m p a n y A d d r 4 < / C o m p a n y A d d r 4 > + 
+             < C o m p a n y A d d r 5 > C o m p a n y A d d r 5 < / C o m p a n y A d d r 5 > + 
+             < C o m p a n y A d d r 6 > C o m p a n y A d d r 6 < / C o m p a n y A d d r 6 > + 
+             < C o m p a n y A d d r 7 > C o m p a n y A d d r 7 < / C o m p a n y A d d r 7 > + 
+             < C o m p a n y A d d r 8 > C o m p a n y A d d r 8 < / C o m p a n y A d d r 8 > + 
+             < C o m p a n y I n f o 1 P i c t u r e   / > + 
+             < C o m p a n y I n f o 2 P i c t u r e   / > + 
+             < C o m p a n y I n f o 3 P i c t u r e   / > + 
+             < C o m p a n y I n f o E m a i l > C o m p a n y I n f o E m a i l < / C o m p a n y I n f o E m a i l > + 
+             < C o m p a n y I n f o E m a i l C a p t i o n > C o m p a n y I n f o E m a i l C a p t i o n < / C o m p a n y I n f o E m a i l C a p t i o n > + 
+             < C o m p a n y I n f o H o m e P a g e > C o m p a n y I n f o H o m e P a g e < / C o m p a n y I n f o H o m e P a g e > + 
+             < C o m p a n y I n f o H o m e p a g e C a p t i o n > C o m p a n y I n f o H o m e p a g e C a p t i o n < / C o m p a n y I n f o H o m e p a g e C a p t i o n > + 
+             < C o m p a n y L e g a l O f f i c e > C o m p a n y L e g a l O f f i c e < / C o m p a n y L e g a l O f f i c e > + 
+             < C o m p a n y L e g a l O f f i c e _ L b l > C o m p a n y L e g a l O f f i c e _ L b l < / C o m p a n y L e g a l O f f i c e _ L b l > + 
+             < C o m p a n y P i c t u r e   / > + 
+             < C u r r R e p o r t P a g e N o C a p t i o n > C u r r R e p o r t P a g e N o C a p t i o n < / C u r r R e p o r t P a g e N o C a p t i o n > + 
+             < C u s t A d d r 1 > C u s t A d d r 1 < / C u s t A d d r 1 > + 
+             < C u s t A d d r 2 > C u s t A d d r 2 < / C u s t A d d r 2 > + 
+             < C u s t A d d r 3 > C u s t A d d r 3 < / C u s t A d d r 3 > + 
+             < C u s t A d d r 4 > C u s t A d d r 4 < / C u s t A d d r 4 > + 
+             < C u s t A d d r 5 > C u s t A d d r 5 < / C u s t A d d r 5 > + 
+             < C u s t A d d r 6 > C u s t A d d r 6 < / C u s t A d d r 6 > + 
+             < C u s t A d d r 7 > C u s t A d d r 7 < / C u s t A d d r 7 > + 
+             < C u s t A d d r 8 > C u s t A d d r 8 < / C u s t A d d r 8 > + 
+             < C u s t B a l a n c e C a p t i o n > C u s t B a l a n c e C a p t i o n < / C u s t B a l a n c e C a p t i o n > + 
+             < D e s c _ C u s t L e d g E n t r y 2 C a p t i o n > D e s c _ C u s t L e d g E n t r y 2 C a p t i o n < / D e s c _ C u s t L e d g E n t r y 2 C a p t i o n > + 
+             < D o c D a t e C a p t i o n > D o c D a t e C a p t i o n < / D o c D a t e C a p t i o n > + 
+             < D o c N o _ D t l d C u s t L e d g E n t r i e s C a p t i o n > D o c N o _ D t l d C u s t L e d g E n t r i e s C a p t i o n < / D o c N o _ D t l d C u s t L e d g E n t r i e s C a p t i o n > + 
+             < D u e D a t e _ C u s t L e d g E n t r y 2 C a p t i o n > D u e D a t e _ C u s t L e d g E n t r y 2 C a p t i o n < / D u e D a t e _ C u s t L e d g E n t r y 2 C a p t i o n > + 
+             < E n d D a t e > E n d D a t e < / E n d D a t e > + 
+             < E n d D a t e C a p t i o n > E n d D a t e C a p t i o n < / E n d D a t e C a p t i o n > + 
+             < G i r o N o _ C o m p a n y I n f o > G i r o N o _ C o m p a n y I n f o < / G i r o N o _ C o m p a n y I n f o > + 
+             < G i r o N o _ C o m p a n y I n f o C a p t i o n > G i r o N o _ C o m p a n y I n f o C a p t i o n < / G i r o N o _ C o m p a n y I n f o C a p t i o n > + 
+             < L a s t S t a t m n t N o _ C u s t > L a s t S t a t m n t N o _ C u s t < / L a s t S t a t m n t N o _ C u s t > + 
+             < L a s t S t a t m n t N o _ C u s t C a p t i o n > L a s t S t a t m n t N o _ C u s t C a p t i o n < / L a s t S t a t m n t N o _ C u s t C a p t i o n > + 
+             < N o 1 _ C u s t > N o 1 _ C u s t < / N o 1 _ C u s t > + 
+             < N o 1 _ C u s t C a p t i o n > N o 1 _ C u s t C a p t i o n < / N o 1 _ C u s t C a p t i o n > + 
+             < O r i g i n a l A m t _ C u s t L e d g E n t r y 2 C a p t i o n > O r i g i n a l A m t _ C u s t L e d g E n t r y 2 C a p t i o n < / O r i g i n a l A m t _ C u s t L e d g E n t r y 2 C a p t i o n > + 
+             < P h o n e N o _ C o m p a n y I n f o > P h o n e N o _ C o m p a n y I n f o < / P h o n e N o _ C o m p a n y I n f o > + 
+             < P h o n e N o _ C o m p a n y I n f o C a p t i o n > P h o n e N o _ C o m p a n y I n f o C a p t i o n < / P h o n e N o _ C o m p a n y I n f o C a p t i o n > + 
+             < P o s t D a t e _ D t l d C u s t L e d g E n t r i e s C a p t i o n > P o s t D a t e _ D t l d C u s t L e d g E n t r i e s C a p t i o n < / P o s t D a t e _ D t l d C u s t L e d g E n t r i e s C a p t i o n > + 
+             < R e m a i n A m t C u s t L e d g E n t r y 2 C a p t i o n > R e m a i n A m t C u s t L e d g E n t r y 2 C a p t i o n < / R e m a i n A m t C u s t L e d g E n t r y 2 C a p t i o n > + 
+             < S t a r t D a t e > S t a r t D a t e < / S t a r t D a t e > + 
+             < S t a r t D a t e C a p t i o n > S t a r t D a t e C a p t i o n < / S t a r t D a t e C a p t i o n > + 
+             < S t a t e m e n t C a p t i o n > S t a t e m e n t C a p t i o n < / S t a t e m e n t C a p t i o n > + 
+             < T o d a y F o r m a t t e d > T o d a y F o r m a t t e d < / T o d a y F o r m a t t e d > + 
+             < V A T R e g N o _ C o m p a n y I n f o > V A T R e g N o _ C o m p a n y I n f o < / V A T R e g N o _ C o m p a n y I n f o > + 
+             < V A T R e g N o _ C o m p a n y I n f o C a p t i o n > V A T R e g N o _ C o m p a n y I n f o C a p t i o n < / V A T R e g N o _ C o m p a n y I n f o C a p t i o n > + 
+             < C u r r e n c y L o o p > + 
+                 < T o t a l _ C a p t i o n 2 > T o t a l _ C a p t i o n 2 < / T o t a l _ C a p t i o n 2 > + 
+                 < C u s t L e d g E n t r y H d r > + 
+                     < C u r r e n c y 2 C o d e _ C u s t L e d g E n t r y H d r > C u r r e n c y 2 C o d e _ C u s t L e d g E n t r y H d r < / C u r r e n c y 2 C o d e _ C u s t L e d g E n t r y H d r > + 
+                     < C u r r e n c y C o d e 3 > C u r r e n c y C o d e 3 < / C u r r e n c y C o d e 3 > + 
+                     < C u s t B a l a n c e _ C u s t L e d g E n t r y H d r > C u s t B a l a n c e _ C u s t L e d g E n t r y H d r < / C u s t B a l a n c e _ C u s t L e d g E n t r y H d r > + 
+                     < D t l d C u s t L e d g E n t r y T y p e > D t l d C u s t L e d g E n t r y T y p e < / D t l d C u s t L e d g E n t r y T y p e > + 
+                     < E n t r i e s E x i s t s > E n t r i e s E x i s t s < / E n t r i e s E x i s t s > + 
+                     < I s N e w C u s t C u r r e n c y G r o u p > I s N e w C u s t C u r r e n c y G r o u p < / I s N e w C u s t C u r r e n c y G r o u p > + 
+                     < P r i n t L i n e > P r i n t L i n e < / P r i n t L i n e > + 
+                     < S t a r t B a l a n c e > S t a r t B a l a n c e < / S t a r t B a l a n c e > + 
+                     < D t l d C u s t L e d g E n t r i e s > + 
+                         < A m t _ D t l d C u s t L e d g E n t r i e s > A m t _ D t l d C u s t L e d g E n t r i e s < / A m t _ D t l d C u s t L e d g E n t r i e s > + 
+                         < C u r r C o d e _ D t l d C u s t L e d g E n t r i e s > C u r r C o d e _ D t l d C u s t L e d g E n t r i e s < / C u r r C o d e _ D t l d C u s t L e d g E n t r i e s > + 
+                         < C u r r e n c y 2 C o d e > C u r r e n c y 2 C o d e < / C u r r e n c y 2 C o d e > + 
+                         < C u s t B a l a n c e > C u s t B a l a n c e < / C u s t B a l a n c e > + 
+                         < D e s c r i p t i o n > D e s c r i p t i o n < / D e s c r i p t i o n > + 
+                         < D o c N o _ D t l d C u s t L e d g E n t r i e s > D o c N o _ D t l d C u s t L e d g E n t r i e s < / D o c N o _ D t l d C u s t L e d g E n t r i e s > + 
+                         < D u e D a t e _ D t l d C u s t L e d g E n t r i e s > D u e D a t e _ D t l d C u s t L e d g E n t r i e s < / D u e D a t e _ D t l d C u s t L e d g E n t r i e s > + 
+                         < P o s t D a t e _ D t l d C u s t L e d g E n t r i e s > P o s t D a t e _ D t l d C u s t L e d g E n t r i e s < / P o s t D a t e _ D t l d C u s t L e d g E n t r i e s > + 
+                         < R e m a i n A m t _ D t l d C u s t L e d g E n t r i e s > R e m a i n A m t _ D t l d C u s t L e d g E n t r i e s < / R e m a i n A m t _ D t l d C u s t L e d g E n t r i e s > + 
+                         < Y o u r R e f e r e n c e _ D t l d C u s t L e d g E n t r i e s > Y o u r R e f e r e n c e _ D t l d C u s t L e d g E n t r i e s < / Y o u r R e f e r e n c e _ D t l d C u s t L e d g E n t r i e s >   
                      < / D t l d C u s t L e d g E n t r i e s >   
                  < / C u s t L e d g E n t r y H d r >   
-                 < C u s t L e d g E n t r y F o o t e r   E l e m e n t T y p e = " D a t a I t e m "   E l e m e n t I d = " 9 2 5 1 1 8 7 3 5 " > - 
-                     < C u r r e n c y C o d e 3 _ C u s t L e d g E n t r y F o o t e r   E l e m e n t T y p e = " C o l u m n "   E l e m e n t I d = " 1 7 6 5 6 9 2 8 1 "   D a t a T y p e = " C o d e " > C u r r e n c y C o d e 3 _ C u s t L e d g E n t r y F o o t e r < / C u r r e n c y C o d e 3 _ C u s t L e d g E n t r y F o o t e r > - 
-                     < C u s t B a l a n c e _ C u s t L e d g E n t r y H d r F o o t e r   E l e m e n t T y p e = " C o l u m n "   E l e m e n t I d = " 1 3 6 7 2 1 4 5 9 3 "   D a t a T y p e = " D e c i m a l " > C u s t B a l a n c e _ C u s t L e d g E n t r y H d r F o o t e r < / C u s t B a l a n c e _ C u s t L e d g E n t r y H d r F o o t e r > - 
-                     < E n t r i e s E x i s t s l _ C u s t L e d g E n t r y F o o t e r C a p t i o n   E l e m e n t T y p e = " C o l u m n "   E l e m e n t I d = " 1 1 7 7 0 6 9 2 3 2 "   D a t a T y p e = " B o o l e a n " > E n t r i e s E x i s t s l _ C u s t L e d g E n t r y F o o t e r C a p t i o n < / E n t r i e s E x i s t s l _ C u s t L e d g E n t r y F o o t e r C a p t i o n > - 
-                     < T o t a l _ C a p t i o n   E l e m e n t T y p e = " C o l u m n "   E l e m e n t I d = " 6 1 1 5 9 7 6 3 4 "   D a t a T y p e = " L a b e l " > T o t a l _ C a p t i o n < / T o t a l _ C a p t i o n > +                 < C u s t L e d g E n t r y F o o t e r > + 
+                     < C u r r e n c y C o d e 3 _ C u s t L e d g E n t r y F o o t e r > C u r r e n c y C o d e 3 _ C u s t L e d g E n t r y F o o t e r < / C u r r e n c y C o d e 3 _ C u s t L e d g E n t r y F o o t e r > + 
+                     < C u s t B a l a n c e _ C u s t L e d g E n t r y H d r F o o t e r > C u s t B a l a n c e _ C u s t L e d g E n t r y H d r F o o t e r < / C u s t B a l a n c e _ C u s t L e d g E n t r y H d r F o o t e r > + 
+                     < E n t r i e s E x i s t s l _ C u s t L e d g E n t r y F o o t e r C a p t i o n > E n t r i e s E x i s t s l _ C u s t L e d g E n t r y F o o t e r C a p t i o n < / E n t r i e s E x i s t s l _ C u s t L e d g E n t r y F o o t e r C a p t i o n > + 
+                     < T o t a l _ C a p t i o n > T o t a l _ C a p t i o n < / T o t a l _ C a p t i o n >   
                  < / C u s t L e d g E n t r y F o o t e r >   
-                 < O v e r d u e V i s i b l e   E l e m e n t T y p e = " D a t a I t e m "   E l e m e n t I d = " 1 4 2 6 6 4 4 0 8 7 " > - 
-                     < C u r r e n c y C o d e 3 _ C u s t L e d g E n t r y 2   E l e m e n t T y p e = " C o l u m n "   E l e m e n t I d = " 1 4 9 4 2 9 8 6 2 2 "   D a t a T y p e = " C o d e " > C u r r e n c y C o d e 3 _ C u s t L e d g E n t r y 2 < / C u r r e n c y C o d e 3 _ C u s t L e d g E n t r y 2 > - 
-                     < D e s c _ C u s t L e d g E n t r y 2 C a p t i o n 2   E l e m e n t T y p e = " C o l u m n "   E l e m e n t I d = " 1 9 5 4 6 4 5 1 6 2 "   D a t a T y p e = " S t r i n g " > D e s c _ C u s t L e d g E n t r y 2 C a p t i o n 2 < / D e s c _ C u s t L e d g E n t r y 2 C a p t i o n 2 > - 
-                     < D o c N o _ D t l d C u s t L e d g E n t r i e s C a p t i o n 2   E l e m e n t T y p e = " C o l u m n "   E l e m e n t I d = " 1 0 9 6 5 7 7 3 7 8 "   D a t a T y p e = " S t r i n g " > D o c N o _ D t l d C u s t L e d g E n t r i e s C a p t i o n 2 < / D o c N o _ D t l d C u s t L e d g E n t r i e s C a p t i o n 2 > - 
-                     < D u e D a t e _ C u s t L e d g E n t r y 2 C a p t i o n 2   E l e m e n t T y p e = " C o l u m n "   E l e m e n t I d = " 9 0 1 1 8 8 6 8 5 "   D a t a T y p e = " L a b e l " > D u e D a t e _ C u s t L e d g E n t r y 2 C a p t i o n 2 < / D u e D a t e _ C u s t L e d g E n t r y 2 C a p t i o n 2 > - 
-                     < O r i g i n a l A m t _ C u s t L e d g E n t r y 2 C a p t i o n 2   E l e m e n t T y p e = " C o l u m n "   E l e m e n t I d = " 1 6 4 9 8 2 3 4 6 6 "   D a t a T y p e = " S t r i n g " > O r i g i n a l A m t _ C u s t L e d g E n t r y 2 C a p t i o n 2 < / O r i g i n a l A m t _ C u s t L e d g E n t r y 2 C a p t i o n 2 > - 
-                     < O v e r D u e E n t r i e s   E l e m e n t T y p e = " C o l u m n "   E l e m e n t I d = " 2 3 9 2 5 5 2 1 3 "   D a t a T y p e = " S t r i n g " > O v e r D u e E n t r i e s < / O v e r D u e E n t r i e s > - 
-                     < P o s t D a t e _ D t l d C u s t L e d g E n t r i e s C a p t i o n 2   E l e m e n t T y p e = " C o l u m n "   E l e m e n t I d = " 7 1 5 0 7 2 1 9 7 "   D a t a T y p e = " L a b e l " > P o s t D a t e _ D t l d C u s t L e d g E n t r i e s C a p t i o n 2 < / P o s t D a t e _ D t l d C u s t L e d g E n t r i e s C a p t i o n 2 > - 
-                     < R e m a i n A m t C u s t L e d g E n t r y 2 C a p t i o n 2   E l e m e n t T y p e = " C o l u m n "   E l e m e n t I d = " 5 0 5 0 3 3 9 6 0 "   D a t a T y p e = " S t r i n g " > R e m a i n A m t C u s t L e d g E n t r y 2 C a p t i o n 2 < / R e m a i n A m t C u s t L e d g E n t r y 2 C a p t i o n 2 > - 
-                     < T o t a l _ C a p t i o n 3   E l e m e n t T y p e = " C o l u m n "   E l e m e n t I d = " 4 3 8 5 6 6 3 5 7 "   D a t a T y p e = " L a b e l " > T o t a l _ C a p t i o n 3 < / T o t a l _ C a p t i o n 3 > - 
-                     < C u s t L e d g E n t r y 2   E l e m e n t T y p e = " D a t a I t e m "   E l e m e n t I d = " 1 3 7 2 6 3 7 0 0 8 " > - 
-                         < C u r r C o d e _ C u s t L e d g E n t r y 2   E l e m e n t T y p e = " C o l u m n "   E l e m e n t I d = " 1 5 8 9 5 4 6 2 6 8 "   D a t a T y p e = " C o d e " > C u r r C o d e _ C u s t L e d g E n t r y 2 < / C u r r C o d e _ C u s t L e d g E n t r y 2 > - 
-                         < C u r r e n c y 2 C o d e _ C u s t L e d g E n t r y 2   E l e m e n t T y p e = " C o l u m n "   E l e m e n t I d = " 1 4 2 6 8 6 9 3 0 3 "   D a t a T y p e = " C o d e " > C u r r e n c y 2 C o d e _ C u s t L e d g E n t r y 2 < / C u r r e n c y 2 C o d e _ C u s t L e d g E n t r y 2 > - 
-                         < C u s t N o _ C u s t L e d g E n t r y 2   E l e m e n t T y p e = " C o l u m n "   E l e m e n t I d = " 1 3 5 3 0 8 9 7 4 5 "   D a t a T y p e = " C o d e " > C u s t N o _ C u s t L e d g E n t r y 2 < / C u s t N o _ C u s t L e d g E n t r y 2 > - 
-                         < D e s c _ C u s t L e d g E n t r y 2   E l e m e n t T y p e = " C o l u m n "   E l e m e n t I d = " 4 0 4 4 4 3 7 9 8 "   D a t a T y p e = " T e x t " > D e s c _ C u s t L e d g E n t r y 2 < / D e s c _ C u s t L e d g E n t r y 2 > - 
-                         < D o c N o _ C u s t L e d g E n t r y 2   E l e m e n t T y p e = " C o l u m n "   E l e m e n t I d = " 5 1 0 9 1 4 9 4 "   D a t a T y p e = " C o d e " > D o c N o _ C u s t L e d g E n t r y 2 < / D o c N o _ C u s t L e d g E n t r y 2 > - 
-                         < D u e D a t e _ C u s t L e d g E n t r y 2   E l e m e n t T y p e = " C o l u m n "   E l e m e n t I d = " 1 6 3 5 3 6 3 6 4 7 "   D a t a T y p e = " S t r i n g " > D u e D a t e _ C u s t L e d g E n t r y 2 < / D u e D a t e _ C u s t L e d g E n t r y 2 > - 
-                         < O r i g i n a l A m t _ C u s t L e d g E n t r y 2   E l e m e n t T y p e = " C o l u m n "   E l e m e n t I d = " 6 5 4 0 4 5 0 9 8 "   D a t a T y p e = " D e c i m a l " > O r i g i n a l A m t _ C u s t L e d g E n t r y 2 < / O r i g i n a l A m t _ C u s t L e d g E n t r y 2 > - 
-                         < P o s t D a t e _ C u s t L e d g E n t r y 2   E l e m e n t T y p e = " C o l u m n "   E l e m e n t I d = " 1 8 1 7 1 9 2 0 4 3 "   D a t a T y p e = " S t r i n g " > P o s t D a t e _ C u s t L e d g E n t r y 2 < / P o s t D a t e _ C u s t L e d g E n t r y 2 > - 
-                         < P r i n t E n t r i e s D u e   E l e m e n t T y p e = " C o l u m n "   E l e m e n t I d = " 6 9 3 7 0 0 1 2 6 "   D a t a T y p e = " B o o l e a n " > P r i n t E n t r i e s D u e < / P r i n t E n t r i e s D u e > - 
-                         < R e m a i n A m t _ C u s t L e d g E n t r y 2   E l e m e n t T y p e = " C o l u m n "   E l e m e n t I d = " 7 5 6 3 4 5 4 1 3 "   D a t a T y p e = " D e c i m a l " > R e m a i n A m t _ C u s t L e d g E n t r y 2 < / R e m a i n A m t _ C u s t L e d g E n t r y 2 > - 
-                         < Y o u r R e f e r e n c e _ C u s t L e d g E n t r y 2   E l e m e n t T y p e = " C o l u m n "   E l e m e n t I d = " 2 0 5 5 4 0 4 3 9 5 "   D a t a T y p e = " T e x t " > Y o u r R e f e r e n c e _ C u s t L e d g E n t r y 2 < / Y o u r R e f e r e n c e _ C u s t L e d g E n t r y 2 > +                 < O v e r d u e V i s i b l e > + 
+                     < C u r r e n c y C o d e 3 _ C u s t L e d g E n t r y 2 > C u r r e n c y C o d e 3 _ C u s t L e d g E n t r y 2 < / C u r r e n c y C o d e 3 _ C u s t L e d g E n t r y 2 > + 
+                     < D e s c _ C u s t L e d g E n t r y 2 C a p t i o n 2 > D e s c _ C u s t L e d g E n t r y 2 C a p t i o n 2 < / D e s c _ C u s t L e d g E n t r y 2 C a p t i o n 2 > + 
+                     < D o c N o _ D t l d C u s t L e d g E n t r i e s C a p t i o n 2 > D o c N o _ D t l d C u s t L e d g E n t r i e s C a p t i o n 2 < / D o c N o _ D t l d C u s t L e d g E n t r i e s C a p t i o n 2 > + 
+                     < D u e D a t e _ C u s t L e d g E n t r y 2 C a p t i o n 2 > D u e D a t e _ C u s t L e d g E n t r y 2 C a p t i o n 2 < / D u e D a t e _ C u s t L e d g E n t r y 2 C a p t i o n 2 > + 
+                     < O r i g i n a l A m t _ C u s t L e d g E n t r y 2 C a p t i o n 2 > O r i g i n a l A m t _ C u s t L e d g E n t r y 2 C a p t i o n 2 < / O r i g i n a l A m t _ C u s t L e d g E n t r y 2 C a p t i o n 2 > + 
+                     < O v e r D u e E n t r i e s > O v e r D u e E n t r i e s < / O v e r D u e E n t r i e s > + 
+                     < P o s t D a t e _ D t l d C u s t L e d g E n t r i e s C a p t i o n 2 > P o s t D a t e _ D t l d C u s t L e d g E n t r i e s C a p t i o n 2 < / P o s t D a t e _ D t l d C u s t L e d g E n t r i e s C a p t i o n 2 > + 
+                     < R e m a i n A m t C u s t L e d g E n t r y 2 C a p t i o n 2 > R e m a i n A m t C u s t L e d g E n t r y 2 C a p t i o n 2 < / R e m a i n A m t C u s t L e d g E n t r y 2 C a p t i o n 2 > + 
+                     < T o t a l _ C a p t i o n 3 > T o t a l _ C a p t i o n 3 < / T o t a l _ C a p t i o n 3 > + 
+                     < C u s t L e d g E n t r y 2 > + 
+                         < C u r r C o d e _ C u s t L e d g E n t r y 2 > C u r r C o d e _ C u s t L e d g E n t r y 2 < / C u r r C o d e _ C u s t L e d g E n t r y 2 > + 
+                         < C u r r e n c y 2 C o d e _ C u s t L e d g E n t r y 2 > C u r r e n c y 2 C o d e _ C u s t L e d g E n t r y 2 < / C u r r e n c y 2 C o d e _ C u s t L e d g E n t r y 2 > + 
+                         < C u s t N o _ C u s t L e d g E n t r y 2 > C u s t N o _ C u s t L e d g E n t r y 2 < / C u s t N o _ C u s t L e d g E n t r y 2 > + 
+                         < D e s c _ C u s t L e d g E n t r y 2 > D e s c _ C u s t L e d g E n t r y 2 < / D e s c _ C u s t L e d g E n t r y 2 > + 
+                         < D o c N o _ C u s t L e d g E n t r y 2 > D o c N o _ C u s t L e d g E n t r y 2 < / D o c N o _ C u s t L e d g E n t r y 2 > + 
+                         < D u e D a t e _ C u s t L e d g E n t r y 2 > D u e D a t e _ C u s t L e d g E n t r y 2 < / D u e D a t e _ C u s t L e d g E n t r y 2 > + 
+                         < O r i g i n a l A m t _ C u s t L e d g E n t r y 2 > O r i g i n a l A m t _ C u s t L e d g E n t r y 2 < / O r i g i n a l A m t _ C u s t L e d g E n t r y 2 > + 
+                         < P o s t D a t e _ C u s t L e d g E n t r y 2 > P o s t D a t e _ C u s t L e d g E n t r y 2 < / P o s t D a t e _ C u s t L e d g E n t r y 2 > + 
+                         < P r i n t E n t r i e s D u e > P r i n t E n t r i e s D u e < / P r i n t E n t r i e s D u e > + 
+                         < R e m a i n A m t _ C u s t L e d g E n t r y 2 > R e m a i n A m t _ C u s t L e d g E n t r y 2 < / R e m a i n A m t _ C u s t L e d g E n t r y 2 > + 
+                         < Y o u r R e f e r e n c e _ C u s t L e d g E n t r y 2 > Y o u r R e f e r e n c e _ C u s t L e d g E n t r y 2 < / Y o u r R e f e r e n c e _ C u s t L e d g E n t r y 2 >   
                      < / C u s t L e d g E n t r y 2 >   
-                     < O v e r d u e E n t r y F o o d e r   E l e m e n t T y p e = " D a t a I t e m "   E l e m e n t I d = " 1 6 5 9 2 3 5 9 3 4 " > - 
-                         < O v e r d u e B a l a n c e   E l e m e n t T y p e = " C o l u m n "   E l e m e n t I d = " 1 1 8 6 1 4 8 4 3 9 "   D a t a T y p e = " D e c i m a l " > O v e r d u e B a l a n c e < / O v e r d u e B a l a n c e > +                     < O v e r d u e E n t r y F o o d e r > + 
+                         < O v e r d u e B a l a n c e > O v e r d u e B a l a n c e < / O v e r d u e B a l a n c e >   
                      < / O v e r d u e E n t r y F o o d e r >   
@@ -7217,51 +7179,51 @@
  
              < / C u r r e n c y L o o p >   
-             < A g i n g B a n d V i s i b l e   E l e m e n t T y p e = " D a t a I t e m "   E l e m e n t I d = " 1 9 4 1 7 6 5 1 4 0 " > - 
-                 < A g i n g C u s t L e d g E n t r y   E l e m e n t T y p e = " D a t a I t e m "   E l e m e n t I d = " 7 0 4 1 6 5 1 3 2 " / > - 
-                 < A g i n g B a n d L o o p   E l e m e n t T y p e = " D a t a I t e m "   E l e m e n t I d = " 1 5 2 9 3 9 4 0 2 2 " > - 
-                     < A g i n g B a n d B u f C o l 1 A m t   E l e m e n t T y p e = " C o l u m n "   E l e m e n t I d = " 1 9 4 8 7 4 9 4 5 4 "   D a t a T y p e = " D e c i m a l " > A g i n g B a n d B u f C o l 1 A m t < / A g i n g B a n d B u f C o l 1 A m t > - 
-                     < A g i n g B a n d B u f C o l 2 A m t   E l e m e n t T y p e = " C o l u m n "   E l e m e n t I d = " 1 9 5 6 4 3 5 6 1 5 "   D a t a T y p e = " D e c i m a l " > A g i n g B a n d B u f C o l 2 A m t < / A g i n g B a n d B u f C o l 2 A m t > - 
-                     < A g i n g B a n d B u f C o l 3 A m t   E l e m e n t T y p e = " C o l u m n "   E l e m e n t I d = " 9 7 5 6 7 9 1 5 2 "   D a t a T y p e = " D e c i m a l " > A g i n g B a n d B u f C o l 3 A m t < / A g i n g B a n d B u f C o l 3 A m t > - 
-                     < A g i n g B a n d B u f C o l 4 A m t   E l e m e n t T y p e = " C o l u m n "   E l e m e n t I d = " 1 2 3 5 5 5 5 7 0 5 "   D a t a T y p e = " D e c i m a l " > A g i n g B a n d B u f C o l 4 A m t < / A g i n g B a n d B u f C o l 4 A m t > - 
-                     < A g i n g B a n d B u f C o l 5 A m t   E l e m e n t T y p e = " C o l u m n "   E l e m e n t I d = " 4 2 4 7 8 1 3 0 2 "   D a t a T y p e = " D e c i m a l " > A g i n g B a n d B u f C o l 5 A m t < / A g i n g B a n d B u f C o l 5 A m t > - 
-                     < A g i n g B a n d C u r r e n c y C o d e   E l e m e n t T y p e = " C o l u m n "   E l e m e n t I d = " 1 3 1 1 1 3 8 9 6 8 "   D a t a T y p e = " C o d e " > A g i n g B a n d C u r r e n c y C o d e < / A g i n g B a n d C u r r e n c y C o d e > - 
-                     < A g i n g B a n d E n d i n g D a t e   E l e m e n t T y p e = " C o l u m n "   E l e m e n t I d = " 1 3 9 0 8 7 6 8 7 "   D a t a T y p e = " S t r i n g " > A g i n g B a n d E n d i n g D a t e < / A g i n g B a n d E n d i n g D a t e > - 
-                     < A g i n g D a t e 1   E l e m e n t T y p e = " C o l u m n "   E l e m e n t I d = " 4 7 9 6 0 6 2 6 6 "   D a t a T y p e = " S t r i n g " > A g i n g D a t e 1 < / A g i n g D a t e 1 > - 
-                     < A g i n g D a t e 2   E l e m e n t T y p e = " C o l u m n "   E l e m e n t I d = " 1 1 1 7 3 0 2 8 8 3 "   D a t a T y p e = " S t r i n g " > A g i n g D a t e 2 < / A g i n g D a t e 2 > - 
-                     < A g i n g D a t e 2 1   E l e m e n t T y p e = " C o l u m n "   E l e m e n t I d = " 3 1 3 5 0 1 0 6 8 "   D a t a T y p e = " S t r i n g " > A g i n g D a t e 2 1 < / A g i n g D a t e 2 1 > - 
-                     < A g i n g D a t e 3   E l e m e n t T y p e = " C o l u m n "   E l e m e n t I d = " 1 7 5 4 9 9 9 5 0 0 "   D a t a T y p e = " S t r i n g " > A g i n g D a t e 3 < / A g i n g D a t e 3 > - 
-                     < A g i n g D a t e 3 1   E l e m e n t T y p e = " C o l u m n "   E l e m e n t I d = " 1 9 1 4 0 6 0 5 3 1 "   D a t a T y p e = " S t r i n g " > A g i n g D a t e 3 1 < / A g i n g D a t e 3 1 > - 
-                     < A g i n g D a t e 4   E l e m e n t T y p e = " C o l u m n "   E l e m e n t I d = " 1 9 0 2 2 7 1 1 7 9 "   D a t a T y p e = " S t r i n g " > A g i n g D a t e 4 < / A g i n g D a t e 4 > - 
-                     < A g i n g D a t e 4 1   E l e m e n t T y p e = " C o l u m n "   E l e m e n t I d = " 8 4 9 7 6 9 6 1 0 "   D a t a T y p e = " S t r i n g " > A g i n g D a t e 4 1 < / A g i n g D a t e 4 1 > - 
-                     < A g i n g D a t e 5   E l e m e n t T y p e = " C o l u m n "   E l e m e n t I d = " 1 2 6 4 5 7 4 5 6 2 "   D a t a T y p e = " S t r i n g " > A g i n g D a t e 5 < / A g i n g D a t e 5 > - 
-                     < A g i n g D a t e H e a d e r 1   E l e m e n t T y p e = " C o l u m n "   E l e m e n t I d = " 2 8 6 3 5 0 7 5 9 "   D a t a T y p e = " T e x t " > A g i n g D a t e H e a d e r 1 < / A g i n g D a t e H e a d e r 1 > - 
-                     < A g i n g D a t e H e a d e r 2   E l e m e n t T y p e = " C o l u m n "   E l e m e n t I d = " 3 5 1 3 4 5 8 5 8 "   D a t a T y p e = " T e x t " > A g i n g D a t e H e a d e r 2 < / A g i n g D a t e H e a d e r 2 > - 
-                     < A g i n g D a t e H e a d e r 3   E l e m e n t T y p e = " C o l u m n "   E l e m e n t I d = " 9 8 9 0 4 2 4 7 5 "   D a t a T y p e = " T e x t " > A g i n g D a t e H e a d e r 3 < / A g i n g D a t e H e a d e r 3 > - 
-                     < A g i n g D a t e H e a d e r 4   E l e m e n t T y p e = " C o l u m n "   E l e m e n t I d = " 1 6 2 6 7 3 9 0 9 2 "   D a t a T y p e = " T e x t " > A g i n g D a t e H e a d e r 4 < / A g i n g D a t e H e a d e r 4 > - 
-                     < b e f o r e C a p t i o n   E l e m e n t T y p e = " C o l u m n "   E l e m e n t I d = " 1 0 1 3 0 1 9 7 1 8 "   D a t a T y p e = " L a b e l " > b e f o r e C a p t i o n < / b e f o r e C a p t i o n > +             < A g i n g B a n d V i s i b l e > + 
+                 < A g i n g C u s t L e d g E n t r y   / > + 
+                 < A g i n g B a n d L o o p > + 
+                     < A g i n g B a n d B u f C o l 1 A m t > A g i n g B a n d B u f C o l 1 A m t < / A g i n g B a n d B u f C o l 1 A m t > + 
+                     < A g i n g B a n d B u f C o l 2 A m t > A g i n g B a n d B u f C o l 2 A m t < / A g i n g B a n d B u f C o l 2 A m t > + 
+                     < A g i n g B a n d B u f C o l 3 A m t > A g i n g B a n d B u f C o l 3 A m t < / A g i n g B a n d B u f C o l 3 A m t > + 
+                     < A g i n g B a n d B u f C o l 4 A m t > A g i n g B a n d B u f C o l 4 A m t < / A g i n g B a n d B u f C o l 4 A m t > + 
+                     < A g i n g B a n d B u f C o l 5 A m t > A g i n g B a n d B u f C o l 5 A m t < / A g i n g B a n d B u f C o l 5 A m t > + 
+                     < A g i n g B a n d C u r r e n c y C o d e > A g i n g B a n d C u r r e n c y C o d e < / A g i n g B a n d C u r r e n c y C o d e > + 
+                     < A g i n g B a n d E n d i n g D a t e > A g i n g B a n d E n d i n g D a t e < / A g i n g B a n d E n d i n g D a t e > + 
+                     < A g i n g D a t e 1 > A g i n g D a t e 1 < / A g i n g D a t e 1 > + 
+                     < A g i n g D a t e 2 > A g i n g D a t e 2 < / A g i n g D a t e 2 > + 
+                     < A g i n g D a t e 2 1 > A g i n g D a t e 2 1 < / A g i n g D a t e 2 1 > + 
+                     < A g i n g D a t e 3 > A g i n g D a t e 3 < / A g i n g D a t e 3 > + 
+                     < A g i n g D a t e 3 1 > A g i n g D a t e 3 1 < / A g i n g D a t e 3 1 > + 
+                     < A g i n g D a t e 4 > A g i n g D a t e 4 < / A g i n g D a t e 4 > + 
+                     < A g i n g D a t e 4 1 > A g i n g D a t e 4 1 < / A g i n g D a t e 4 1 > + 
+                     < A g i n g D a t e 5 > A g i n g D a t e 5 < / A g i n g D a t e 5 > + 
+                     < A g i n g D a t e H e a d e r 1 > A g i n g D a t e H e a d e r 1 < / A g i n g D a t e H e a d e r 1 > + 
+                     < A g i n g D a t e H e a d e r 2 > A g i n g D a t e H e a d e r 2 < / A g i n g D a t e H e a d e r 2 > + 
+                     < A g i n g D a t e H e a d e r 3 > A g i n g D a t e H e a d e r 3 < / A g i n g D a t e H e a d e r 3 > + 
+                     < A g i n g D a t e H e a d e r 4 > A g i n g D a t e H e a d e r 4 < / A g i n g D a t e H e a d e r 4 > + 
+                     < b e f o r e C a p t i o n > b e f o r e C a p t i o n < / b e f o r e C a p t i o n >   
                  < / A g i n g B a n d L o o p >   
@@ -7269,13 +7231,13 @@
  
          < / I n t e g e r >   
-         < L e t t e r T e x t   E l e m e n t T y p e = " D a t a I t e m "   E l e m e n t I d = " 1 5 1 0 3 5 3 8 3 4 " > - 
-             < B o d y T e x t   E l e m e n t T y p e = " C o l u m n "   E l e m e n t I d = " 1 4 9 7 5 9 8 0 8 "   D a t a T y p e = " L a b e l " > B o d y T e x t < / B o d y T e x t > - 
-             < C l o s i n g T e x t   E l e m e n t T y p e = " C o l u m n "   E l e m e n t I d = " 5 1 2 1 3 5 9 0 9 "   D a t a T y p e = " L a b e l " > C l o s i n g T e x t < / C l o s i n g T e x t > - 
-             < G r e e t i n g T e x t   E l e m e n t T y p e = " C o l u m n "   E l e m e n t I d = " 1 1 7 5 2 7 9 2 8 9 "   D a t a T y p e = " L a b e l " > G r e e t i n g T e x t < / G r e e t i n g T e x t > +         < L e t t e r T e x t > + 
+             < B o d y T e x t > B o d y T e x t < / B o d y T e x t > + 
+             < C l o s i n g T e x t > C l o s i n g T e x t < / C l o s i n g T e x t > + 
+             < G r e e t i n g T e x t > G r e e t i n g T e x t < / G r e e t i n g T e x t >   
          < / L e t t e r T e x t >   
@@ -7284,9 +7246,7 @@
  < / N a v W o r d R e p o r t X m l P a r t > 
 </file>
 
-<file path=customXml/item2.xml>��< ? x m l   v e r s i o n = " 1 . 0 "   e n c o d i n g = " u t f - 1 6 " ? > - 
- < N a v W o r d R e p o r t X m l P a r t   x m l n s = " u r n : m i c r o s o f t - d y n a m i c s - n a v / r e p o r t s / S t a n d a r d _ S t a t e m e n t / 1 3 1 6 / " > +<file path=customXml/item3.xml>��< ? x m l   v e r s i o n = " 1 . 0 "   e n c o d i n g = " u t f - 1 6 " ? > < N a v W o r d R e p o r t X m l P a r t   x m l n s = " u r n : m i c r o s o f t - d y n a m i c s - b u s i n e s s c e n t r a l / i n t e r n a l / e x t e n d e d / r e p o r t s / S t a n d a r d _ S t a t e m e n t / 1 3 1 6 / " >   
      < B C R e p o r t I n f o r m a t i o n >   
@@ -7352,247 +7312,249 @@
  
      < / B C R e p o r t I n f o r m a t i o n >   
-     < C u s t o m e r > - 
-         < C F S C u s t A d d r e s s 1 > C F S C u s t A d d r e s s 1 < / C F S C u s t A d d r e s s 1 > - 
-         < C F S C u s t A d d r e s s 2 > C F S C u s t A d d r e s s 2 < / C F S C u s t A d d r e s s 2 > - 
-         < C F S C u s t A d d r e s s 3 > C F S C u s t A d d r e s s 3 < / C F S C u s t A d d r e s s 3 > - 
-         < C F S C u s t A d d r e s s 4 > C F S C u s t A d d r e s s 4 < / C F S C u s t A d d r e s s 4 > - 
-         < C F S C u s t A d d r e s s 5 > C F S C u s t A d d r e s s 5 < / C F S C u s t A d d r e s s 5 > - 
-         < C F S C u s t A d d r e s s 6 > C F S C u s t A d d r e s s 6 < / C F S C u s t A d d r e s s 6 > - 
-         < C F S C u s t A d d r e s s 7 > C F S C u s t A d d r e s s 7 < / C F S C u s t A d d r e s s 7 > - 
-         < C F S C u s t A d d r e s s 8 > C F S C u s t A d d r e s s 8 < / C F S C u s t A d d r e s s 8 > - 
-         < N o _ C u s t > N o _ C u s t < / N o _ C u s t > - 
-         < I n t e g e r > - 
-             < B a n k A c c N o _ C o m p a n y I n f o > B a n k A c c N o _ C o m p a n y I n f o < / B a n k A c c N o _ C o m p a n y I n f o > - 
-             < B a n k A c c N o _ C o m p a n y I n f o C a p t i o n > B a n k A c c N o _ C o m p a n y I n f o C a p t i o n < / B a n k A c c N o _ C o m p a n y I n f o C a p t i o n > - 
-             < B a n k N a m e _ C o m p a n y I n f o > B a n k N a m e _ C o m p a n y I n f o < / B a n k N a m e _ C o m p a n y I n f o > - 
-             < B a n k N a m e _ C o m p a n y I n f o C a p t i o n > B a n k N a m e _ C o m p a n y I n f o C a p t i o n < / B a n k N a m e _ C o m p a n y I n f o C a p t i o n > - 
-             < C o m p a n y A d d r 1 > C o m p a n y A d d r 1 < / C o m p a n y A d d r 1 > - 
-             < C o m p a n y A d d r 2 > C o m p a n y A d d r 2 < / C o m p a n y A d d r 2 > - 
-             < C o m p a n y A d d r 3 > C o m p a n y A d d r 3 < / C o m p a n y A d d r 3 > - 
-             < C o m p a n y A d d r 4 > C o m p a n y A d d r 4 < / C o m p a n y A d d r 4 > - 
-             < C o m p a n y A d d r 5 > C o m p a n y A d d r 5 < / C o m p a n y A d d r 5 > - 
-             < C o m p a n y A d d r 6 > C o m p a n y A d d r 6 < / C o m p a n y A d d r 6 > - 
-             < C o m p a n y A d d r 7 > C o m p a n y A d d r 7 < / C o m p a n y A d d r 7 > - 
-             < C o m p a n y A d d r 8 > C o m p a n y A d d r 8 < / C o m p a n y A d d r 8 > - 
-             < C o m p a n y I n f o 1 P i c t u r e   / > - 
-             < C o m p a n y I n f o 2 P i c t u r e   / > - 
-             < C o m p a n y I n f o 3 P i c t u r e   / > - 
-             < C o m p a n y I n f o E m a i l > C o m p a n y I n f o E m a i l < / C o m p a n y I n f o E m a i l > - 
-             < C o m p a n y I n f o E m a i l C a p t i o n > C o m p a n y I n f o E m a i l C a p t i o n < / C o m p a n y I n f o E m a i l C a p t i o n > - 
-             < C o m p a n y I n f o H o m e P a g e > C o m p a n y I n f o H o m e P a g e < / C o m p a n y I n f o H o m e P a g e > - 
-             < C o m p a n y I n f o H o m e p a g e C a p t i o n > C o m p a n y I n f o H o m e p a g e C a p t i o n < / C o m p a n y I n f o H o m e p a g e C a p t i o n > - 
-             < C o m p a n y L e g a l O f f i c e > C o m p a n y L e g a l O f f i c e < / C o m p a n y L e g a l O f f i c e > - 
-             < C o m p a n y L e g a l O f f i c e _ L b l > C o m p a n y L e g a l O f f i c e _ L b l < / C o m p a n y L e g a l O f f i c e _ L b l > - 
-             < C o m p a n y P i c t u r e   / > - 
-             < C u r r R e p o r t P a g e N o C a p t i o n > C u r r R e p o r t P a g e N o C a p t i o n < / C u r r R e p o r t P a g e N o C a p t i o n > - 
-             < C u s t A d d r 1 > C u s t A d d r 1 < / C u s t A d d r 1 > - 
-             < C u s t A d d r 2 > C u s t A d d r 2 < / C u s t A d d r 2 > - 
-             < C u s t A d d r 3 > C u s t A d d r 3 < / C u s t A d d r 3 > - 
-             < C u s t A d d r 4 > C u s t A d d r 4 < / C u s t A d d r 4 > - 
-             < C u s t A d d r 5 > C u s t A d d r 5 < / C u s t A d d r 5 > - 
-             < C u s t A d d r 6 > C u s t A d d r 6 < / C u s t A d d r 6 > - 
-             < C u s t A d d r 7 > C u s t A d d r 7 < / C u s t A d d r 7 > - 
-             < C u s t A d d r 8 > C u s t A d d r 8 < / C u s t A d d r 8 > - 
-             < C u s t B a l a n c e C a p t i o n > C u s t B a l a n c e C a p t i o n < / C u s t B a l a n c e C a p t i o n > - 
-             < D e s c _ C u s t L e d g E n t r y 2 C a p t i o n > D e s c _ C u s t L e d g E n t r y 2 C a p t i o n < / D e s c _ C u s t L e d g E n t r y 2 C a p t i o n > - 
-             < D o c D a t e C a p t i o n > D o c D a t e C a p t i o n < / D o c D a t e C a p t i o n > - 
-             < D o c N o _ D t l d C u s t L e d g E n t r i e s C a p t i o n > D o c N o _ D t l d C u s t L e d g E n t r i e s C a p t i o n < / D o c N o _ D t l d C u s t L e d g E n t r i e s C a p t i o n > - 
-             < D u e D a t e _ C u s t L e d g E n t r y 2 C a p t i o n > D u e D a t e _ C u s t L e d g E n t r y 2 C a p t i o n < / D u e D a t e _ C u s t L e d g E n t r y 2 C a p t i o n > - 
-             < E n d D a t e > E n d D a t e < / E n d D a t e > - 
-             < E n d D a t e C a p t i o n > E n d D a t e C a p t i o n < / E n d D a t e C a p t i o n > - 
-             < G i r o N o _ C o m p a n y I n f o > G i r o N o _ C o m p a n y I n f o < / G i r o N o _ C o m p a n y I n f o > - 
-             < G i r o N o _ C o m p a n y I n f o C a p t i o n > G i r o N o _ C o m p a n y I n f o C a p t i o n < / G i r o N o _ C o m p a n y I n f o C a p t i o n > - 
-             < L a s t S t a t m n t N o _ C u s t > L a s t S t a t m n t N o _ C u s t < / L a s t S t a t m n t N o _ C u s t > - 
-             < L a s t S t a t m n t N o _ C u s t C a p t i o n > L a s t S t a t m n t N o _ C u s t C a p t i o n < / L a s t S t a t m n t N o _ C u s t C a p t i o n > - 
-             < N o 1 _ C u s t > N o 1 _ C u s t < / N o 1 _ C u s t > - 
-             < N o 1 _ C u s t C a p t i o n > N o 1 _ C u s t C a p t i o n < / N o 1 _ C u s t C a p t i o n > - 
-             < O r i g i n a l A m t _ C u s t L e d g E n t r y 2 C a p t i o n > O r i g i n a l A m t _ C u s t L e d g E n t r y 2 C a p t i o n < / O r i g i n a l A m t _ C u s t L e d g E n t r y 2 C a p t i o n > - 
-             < P h o n e N o _ C o m p a n y I n f o > P h o n e N o _ C o m p a n y I n f o < / P h o n e N o _ C o m p a n y I n f o > - 
-             < P h o n e N o _ C o m p a n y I n f o C a p t i o n > P h o n e N o _ C o m p a n y I n f o C a p t i o n < / P h o n e N o _ C o m p a n y I n f o C a p t i o n > - 
-             < P o s t D a t e _ D t l d C u s t L e d g E n t r i e s C a p t i o n > P o s t D a t e _ D t l d C u s t L e d g E n t r i e s C a p t i o n < / P o s t D a t e _ D t l d C u s t L e d g E n t r i e s C a p t i o n > - 
-             < R e m a i n A m t C u s t L e d g E n t r y 2 C a p t i o n > R e m a i n A m t C u s t L e d g E n t r y 2 C a p t i o n < / R e m a i n A m t C u s t L e d g E n t r y 2 C a p t i o n > - 
-             < S t a r t D a t e > S t a r t D a t e < / S t a r t D a t e > - 
-             < S t a r t D a t e C a p t i o n > S t a r t D a t e C a p t i o n < / S t a r t D a t e C a p t i o n > - 
-             < S t a t e m e n t C a p t i o n > S t a t e m e n t C a p t i o n < / S t a t e m e n t C a p t i o n > - 
-             < T o d a y F o r m a t t e d > T o d a y F o r m a t t e d < / T o d a y F o r m a t t e d > - 
-             < V A T R e g N o _ C o m p a n y I n f o > V A T R e g N o _ C o m p a n y I n f o < / V A T R e g N o _ C o m p a n y I n f o > - 
-             < V A T R e g N o _ C o m p a n y I n f o C a p t i o n > V A T R e g N o _ C o m p a n y I n f o C a p t i o n < / V A T R e g N o _ C o m p a n y I n f o C a p t i o n > - 
-             < C u r r e n c y L o o p > - 
-                 < T o t a l _ C a p t i o n 2 > T o t a l _ C a p t i o n 2 < / T o t a l _ C a p t i o n 2 > - 
-                 < C u s t L e d g E n t r y H d r > - 
-                     < C u r r e n c y 2 C o d e _ C u s t L e d g E n t r y H d r > C u r r e n c y 2 C o d e _ C u s t L e d g E n t r y H d r < / C u r r e n c y 2 C o d e _ C u s t L e d g E n t r y H d r > - 
-                     < C u r r e n c y C o d e 3 > C u r r e n c y C o d e 3 < / C u r r e n c y C o d e 3 > - 
-                     < C u s t B a l a n c e _ C u s t L e d g E n t r y H d r > C u s t B a l a n c e _ C u s t L e d g E n t r y H d r < / C u s t B a l a n c e _ C u s t L e d g E n t r y H d r > - 
-                     < D t l d C u s t L e d g E n t r y T y p e > D t l d C u s t L e d g E n t r y T y p e < / D t l d C u s t L e d g E n t r y T y p e > - 
-                     < E n t r i e s E x i s t s > E n t r i e s E x i s t s < / E n t r i e s E x i s t s > - 
-                     < I s N e w C u s t C u r r e n c y G r o u p > I s N e w C u s t C u r r e n c y G r o u p < / I s N e w C u s t C u r r e n c y G r o u p > - 
-                     < P r i n t L i n e > P r i n t L i n e < / P r i n t L i n e > - 
-                     < S t a r t B a l a n c e > S t a r t B a l a n c e < / S t a r t B a l a n c e > - 
-                     < D t l d C u s t L e d g E n t r i e s > - 
-                         < A m t _ D t l d C u s t L e d g E n t r i e s > A m t _ D t l d C u s t L e d g E n t r i e s < / A m t _ D t l d C u s t L e d g E n t r i e s > - 
-                         < C u r r C o d e _ D t l d C u s t L e d g E n t r i e s > C u r r C o d e _ D t l d C u s t L e d g E n t r i e s < / C u r r C o d e _ D t l d C u s t L e d g E n t r i e s > - 
-                         < C u r r e n c y 2 C o d e > C u r r e n c y 2 C o d e < / C u r r e n c y 2 C o d e > - 
-                         < C u s t B a l a n c e > C u s t B a l a n c e < / C u s t B a l a n c e > - 
-                         < D e s c r i p t i o n > D e s c r i p t i o n < / D e s c r i p t i o n > - 
-                         < D o c N o _ D t l d C u s t L e d g E n t r i e s > D o c N o _ D t l d C u s t L e d g E n t r i e s < / D o c N o _ D t l d C u s t L e d g E n t r i e s > - 
-                         < D u e D a t e _ D t l d C u s t L e d g E n t r i e s > D u e D a t e _ D t l d C u s t L e d g E n t r i e s < / D u e D a t e _ D t l d C u s t L e d g E n t r i e s > - 
-                         < P o s t D a t e _ D t l d C u s t L e d g E n t r i e s > P o s t D a t e _ D t l d C u s t L e d g E n t r i e s < / P o s t D a t e _ D t l d C u s t L e d g E n t r i e s > - 
-                         < R e m a i n A m t _ D t l d C u s t L e d g E n t r i e s > R e m a i n A m t _ D t l d C u s t L e d g E n t r i e s < / R e m a i n A m t _ D t l d C u s t L e d g E n t r i e s > - 
-                         < Y o u r R e f e r e n c e _ D t l d C u s t L e d g E n t r i e s > Y o u r R e f e r e n c e _ D t l d C u s t L e d g E n t r i e s < / Y o u r R e f e r e n c e _ D t l d C u s t L e d g E n t r i e s > +     < T o o l t i p s / > + 
+     < C u s t o m e r   E l e m e n t T y p e = " D a t a I t e m "   E l e m e n t I d = " 1 5 2 5 1 9 1 9 9 " > + 
+         < C F S C u s t A d d r e s s 1   E l e m e n t T y p e = " C o l u m n "   E l e m e n t I d = " 1 0 1 0 7 4 5 6 2 7 "   D a t a T y p e = " T e x t " > C F S C u s t A d d r e s s 1 < / C F S C u s t A d d r e s s 1 > + 
+         < C F S C u s t A d d r e s s 2   E l e m e n t T y p e = " C o l u m n "   E l e m e n t I d = " 3 7 3 0 4 9 0 1 0 "   D a t a T y p e = " T e x t " > C F S C u s t A d d r e s s 2 < / C F S C u s t A d d r e s s 2 > + 
+         < C F S C u s t A d d r e s s 3   E l e m e n t T y p e = " C o l u m n "   E l e m e n t I d = " 2 6 4 6 4 7 6 0 7 "   D a t a T y p e = " T e x t " > C F S C u s t A d d r e s s 3 < / C F S C u s t A d d r e s s 3 > + 
+         < C F S C u s t A d d r e s s 4   E l e m e n t T y p e = " C o l u m n "   E l e m e n t I d = " 9 5 7 3 8 5 8 4 "   D a t a T y p e = " T e x t " > C F S C u s t A d d r e s s 4 < / C F S C u s t A d d r e s s 4 > + 
+         < C F S C u s t A d d r e s s 5   E l e m e n t T y p e = " C o l u m n "   E l e m e n t I d = " 7 3 3 4 3 5 2 0 1 "   D a t a T y p e = " T e x t " > C F S C u s t A d d r e s s 5 < / C F S C u s t A d d r e s s 5 > + 
+         < C F S C u s t A d d r e s s 6   E l e m e n t T y p e = " C o l u m n "   E l e m e n t I d = " 1 3 7 1 1 3 1 8 1 8 "   D a t a T y p e = " T e x t " > C F S C u s t A d d r e s s 6 < / C F S C u s t A d d r e s s 6 > + 
+         < C F S C u s t A d d r e s s 7   E l e m e n t T y p e = " C o l u m n "   E l e m e n t I d = " 2 0 0 8 8 2 8 4 3 5 "   D a t a T y p e = " T e x t " > C F S C u s t A d d r e s s 7 < / C F S C u s t A d d r e s s 7 > + 
+         < C F S C u s t A d d r e s s 8   E l e m e n t T y p e = " C o l u m n "   E l e m e n t I d = " 1 8 3 9 9 1 9 4 1 2 "   D a t a T y p e = " T e x t " > C F S C u s t A d d r e s s 8 < / C F S C u s t A d d r e s s 8 > + 
+         < N o _ C u s t   E l e m e n t T y p e = " C o l u m n "   E l e m e n t I d = " 6 0 3 9 7 0 8 4 6 "   D a t a T y p e = " C o d e " > N o _ C u s t < / N o _ C u s t > + 
+         < I n t e g e r   E l e m e n t T y p e = " D a t a I t e m "   E l e m e n t I d = " 1 7 3 5 6 9 8 6 1 9 " > + 
+             < B a n k A c c N o _ C o m p a n y I n f o   E l e m e n t T y p e = " C o l u m n "   E l e m e n t I d = " 8 6 4 5 4 5 9 0 7 "   D a t a T y p e = " T e x t " > B a n k A c c N o _ C o m p a n y I n f o < / B a n k A c c N o _ C o m p a n y I n f o > + 
+             < B a n k A c c N o _ C o m p a n y I n f o C a p t i o n   E l e m e n t T y p e = " C o l u m n "   E l e m e n t I d = " 1 9 1 8 8 5 3 8 1 3 "   D a t a T y p e = " L a b e l " > B a n k A c c N o _ C o m p a n y I n f o C a p t i o n < / B a n k A c c N o _ C o m p a n y I n f o C a p t i o n > + 
+             < B a n k N a m e _ C o m p a n y I n f o   E l e m e n t T y p e = " C o l u m n "   E l e m e n t I d = " 1 9 1 7 2 0 2 0 4 2 "   D a t a T y p e = " T e x t " > B a n k N a m e _ C o m p a n y I n f o < / B a n k N a m e _ C o m p a n y I n f o > + 
+             < B a n k N a m e _ C o m p a n y I n f o C a p t i o n   E l e m e n t T y p e = " C o l u m n "   E l e m e n t I d = " 1 6 0 4 3 0 7 5 8 8 "   D a t a T y p e = " L a b e l " > B a n k N a m e _ C o m p a n y I n f o C a p t i o n < / B a n k N a m e _ C o m p a n y I n f o C a p t i o n > + 
+             < C o m p a n y A d d r 1   E l e m e n t T y p e = " C o l u m n "   E l e m e n t I d = " 8 8 5 0 9 6 1 0 4 "   D a t a T y p e = " T e x t " > C o m p a n y A d d r 1 < / C o m p a n y A d d r 1 > + 
+             < C o m p a n y A d d r 2   E l e m e n t T y p e = " C o l u m n "   E l e m e n t I d = " 1 0 2 7 9 9 3 7 4 7 "   D a t a T y p e = " T e x t " > C o m p a n y A d d r 2 < / C o m p a n y A d d r 2 > + 
+             < C o m p a n y A d d r 3   E l e m e n t T y p e = " C o l u m n "   E l e m e n t I d = " 3 9 0 2 9 7 1 3 0 "   D a t a T y p e = " T e x t " > C o m p a n y A d d r 3 < / C o m p a n y A d d r 3 > + 
+             < C o m p a n y A d d r 4   E l e m e n t T y p e = " C o l u m n "   E l e m e n t I d = " 1 9 9 1 5 8 0 3 1 5 "   D a t a T y p e = " T e x t " > C o m p a n y A d d r 4 < / C o m p a n y A d d r 4 > + 
+             < C o m p a n y A d d r 5   E l e m e n t T y p e = " C o l u m n "   E l e m e n t I d = " 1 6 6 5 6 9 0 3 6 4 "   D a t a T y p e = " T e x t " > C o m p a n y A d d r 5 < / C o m p a n y A d d r 5 > + 
+             < C o m p a n y A d d r 6   E l e m e n t T y p e = " C o l u m n "   E l e m e n t I d = " 7 1 6 1 8 7 0 8 1 "   D a t a T y p e = " T e x t " > C o m p a n y A d d r 6 < / C o m p a n y A d d r 6 > + 
+             < C o m p a n y A d d r 7   E l e m e n t T y p e = " C o l u m n "   E l e m e n t I d = " 1 3 5 3 8 8 3 6 9 8 "   D a t a T y p e = " T e x t " > C o m p a n y A d d r 7 < / C o m p a n y A d d r 7 > + 
+             < C o m p a n y A d d r 8   E l e m e n t T y p e = " C o l u m n "   E l e m e n t I d = " 1 0 5 4 0 0 5 1 2 7 "   D a t a T y p e = " T e x t " > C o m p a n y A d d r 8 < / C o m p a n y A d d r 8 > + 
+             < C o m p a n y I n f o 1 P i c t u r e   E l e m e n t T y p e = " C o l u m n "   E l e m e n t I d = " 1 0 1 8 2 0 6 5 0 3 "   D a t a T y p e = " B l o b " / > + 
+             < C o m p a n y I n f o 2 P i c t u r e   E l e m e n t T y p e = " C o l u m n "   E l e m e n t I d = " 9 8 9 6 7 0 4 7 4 "   D a t a T y p e = " B l o b " / > + 
+             < C o m p a n y I n f o 3 P i c t u r e   E l e m e n t T y p e = " C o l u m n "   E l e m e n t I d = " 5 7 9 7 0 4 0 5 9 "   D a t a T y p e = " B l o b " / > + 
+             < C o m p a n y I n f o E m a i l   E l e m e n t T y p e = " C o l u m n "   E l e m e n t I d = " 9 1 4 8 1 2 2 4 0 "   D a t a T y p e = " T e x t " > C o m p a n y I n f o E m a i l < / C o m p a n y I n f o E m a i l > + 
+             < C o m p a n y I n f o E m a i l C a p t i o n   E l e m e n t T y p e = " C o l u m n "   E l e m e n t I d = " 1 5 5 2 1 6 7 2 3 0 "   D a t a T y p e = " L a b e l " > C o m p a n y I n f o E m a i l C a p t i o n < / C o m p a n y I n f o E m a i l C a p t i o n > + 
+             < C o m p a n y I n f o H o m e P a g e   E l e m e n t T y p e = " C o l u m n "   E l e m e n t I d = " 1 5 3 0 3 1 7 4 4 0 "   D a t a T y p e = " T e x t " > C o m p a n y I n f o H o m e P a g e < / C o m p a n y I n f o H o m e P a g e > + 
+             < C o m p a n y I n f o H o m e p a g e C a p t i o n   E l e m e n t T y p e = " C o l u m n "   E l e m e n t I d = " 1 5 2 9 8 2 3 8 6 "   D a t a T y p e = " L a b e l " > C o m p a n y I n f o H o m e p a g e C a p t i o n < / C o m p a n y I n f o H o m e p a g e C a p t i o n > + 
+             < C o m p a n y L e g a l O f f i c e   E l e m e n t T y p e = " C o l u m n "   E l e m e n t I d = " 7 1 4 2 5 8 1 1 1 "   D a t a T y p e = " T e x t " > C o m p a n y L e g a l O f f i c e < / C o m p a n y L e g a l O f f i c e > + 
+             < C o m p a n y L e g a l O f f i c e _ L b l   E l e m e n t T y p e = " C o l u m n "   E l e m e n t I d = " 1 5 3 3 1 7 5 1 0 8 "   D a t a T y p e = " T e x t " > C o m p a n y L e g a l O f f i c e _ L b l < / C o m p a n y L e g a l O f f i c e _ L b l > + 
+             < C o m p a n y P i c t u r e   E l e m e n t T y p e = " C o l u m n "   E l e m e n t I d = " 1 3 9 7 4 1 1 0 7 4 "   D a t a T y p e = " B l o b " / > + 
+             < C u r r R e p o r t P a g e N o C a p t i o n   E l e m e n t T y p e = " C o l u m n "   E l e m e n t I d = " 2 0 2 2 2 2 5 3 5 1 "   D a t a T y p e = " L a b e l " > C u r r R e p o r t P a g e N o C a p t i o n < / C u r r R e p o r t P a g e N o C a p t i o n > + 
+             < C u s t A d d r 1   E l e m e n t T y p e = " C o l u m n "   E l e m e n t I d = " 1 3 6 8 0 2 7 5 2 2 "   D a t a T y p e = " T e x t " > C u s t A d d r 1 < / C u s t A d d r 1 > + 
+             < C u s t A d d r 2   E l e m e n t T y p e = " C o l u m n "   E l e m e n t I d = " 2 0 0 5 7 2 4 1 3 9 "   D a t a T y p e = " T e x t " > C u s t A d d r 2 < / C u s t A d d r 2 > + 
+             < C u s t A d d r 3   E l e m e n t T y p e = " C o l u m n "   E l e m e n t I d = " 1 6 5 1 5 4 6 5 4 0 "   D a t a T y p e = " T e x t " > C u s t A d d r 3 < / C u s t A d d r 3 > + 
+             < C u s t A d d r 4   E l e m e n t T y p e = " C o l u m n "   E l e m e n t I d = " 1 0 1 3 8 4 9 9 2 3 "   D a t a T y p e = " T e x t " > C u s t A d d r 4 < / C u s t A d d r 4 > + 
+             < C u s t A d d r 5   E l e m e n t T y p e = " C o l u m n "   E l e m e n t I d = " 3 7 6 1 5 3 3 0 6 "   D a t a T y p e = " T e x t " > C u s t A d d r 5 < / C u s t A d d r 5 > + 
+             < C u s t A d d r 6   E l e m e n t T y p e = " C o l u m n "   E l e m e n t I d = " 2 6 1 5 4 3 3 1 1 "   D a t a T y p e = " T e x t " > C u s t A d d r 6 < / C u s t A d d r 6 > + 
+             < C u s t A d d r 7   E l e m e n t T y p e = " C o l u m n "   E l e m e n t I d = " 8 9 9 2 3 9 9 2 8 "   D a t a T y p e = " T e x t " > C u s t A d d r 7 < / C u s t A d d r 7 > + 
+             < C u s t A d d r 8   E l e m e n t T y p e = " C o l u m n "   E l e m e n t I d = " 1 5 3 6 9 3 6 5 4 5 "   D a t a T y p e = " T e x t " > C u s t A d d r 8 < / C u s t A d d r 8 > + 
+             < C u s t B a l a n c e C a p t i o n   E l e m e n t T y p e = " C o l u m n "   E l e m e n t I d = " 6 0 8 6 6 1 8 8 4 "   D a t a T y p e = " L a b e l " > C u s t B a l a n c e C a p t i o n < / C u s t B a l a n c e C a p t i o n > + 
+             < D e s c _ C u s t L e d g E n t r y 2 C a p t i o n   E l e m e n t T y p e = " C o l u m n "   E l e m e n t I d = " 1 8 7 4 4 3 7 6 7 2 "   D a t a T y p e = " S t r i n g " > D e s c _ C u s t L e d g E n t r y 2 C a p t i o n < / D e s c _ C u s t L e d g E n t r y 2 C a p t i o n > + 
+             < D o c D a t e C a p t i o n   E l e m e n t T y p e = " C o l u m n "   E l e m e n t I d = " 1 1 5 7 6 2 1 5 3 7 "   D a t a T y p e = " L a b e l " > D o c D a t e C a p t i o n < / D o c D a t e C a p t i o n > + 
+             < D o c N o _ D t l d C u s t L e d g E n t r i e s C a p t i o n   E l e m e n t T y p e = " C o l u m n "   E l e m e n t I d = " 6 0 1 5 1 5 5 5 6 "   D a t a T y p e = " S t r i n g " > D o c N o _ D t l d C u s t L e d g E n t r i e s C a p t i o n < / D o c N o _ D t l d C u s t L e d g E n t r i e s C a p t i o n > + 
+             < D u e D a t e _ C u s t L e d g E n t r y 2 C a p t i o n   E l e m e n t T y p e = " C o l u m n "   E l e m e n t I d = " 8 1 9 2 8 5 8 5 "   D a t a T y p e = " L a b e l " > D u e D a t e _ C u s t L e d g E n t r y 2 C a p t i o n < / D u e D a t e _ C u s t L e d g E n t r y 2 C a p t i o n > + 
+             < E n d D a t e   E l e m e n t T y p e = " C o l u m n "   E l e m e n t I d = " 1 3 0 2 0 8 2 6 1 0 "   D a t a T y p e = " S t r i n g " > E n d D a t e < / E n d D a t e > + 
+             < E n d D a t e C a p t i o n   E l e m e n t T y p e = " C o l u m n "   E l e m e n t I d = " 1 3 5 3 1 9 2 8 0 "   D a t a T y p e = " L a b e l " > E n d D a t e C a p t i o n < / E n d D a t e C a p t i o n > + 
+             < G i r o N o _ C o m p a n y I n f o   E l e m e n t T y p e = " C o l u m n "   E l e m e n t I d = " 5 6 5 4 8 5 5 1 9 "   D a t a T y p e = " T e x t " > G i r o N o _ C o m p a n y I n f o < / G i r o N o _ C o m p a n y I n f o > + 
+             < G i r o N o _ C o m p a n y I n f o C a p t i o n   E l e m e n t T y p e = " C o l u m n "   E l e m e n t I d = " 1 6 5 8 5 3 3 3 6 9 "   D a t a T y p e = " L a b e l " > G i r o N o _ C o m p a n y I n f o C a p t i o n < / G i r o N o _ C o m p a n y I n f o C a p t i o n > + 
+             < L a s t S t a t m n t N o _ C u s t   E l e m e n t T y p e = " C o l u m n "   E l e m e n t I d = " 1 3 8 8 0 8 0 0 2 9 "   D a t a T y p e = " S t r i n g " > L a s t S t a t m n t N o _ C u s t < / L a s t S t a t m n t N o _ C u s t > + 
+             < L a s t S t a t m n t N o _ C u s t C a p t i o n   E l e m e n t T y p e = " C o l u m n "   E l e m e n t I d = " 8 9 2 5 6 7 8 3 5 "   D a t a T y p e = " L a b e l " > L a s t S t a t m n t N o _ C u s t C a p t i o n < / L a s t S t a t m n t N o _ C u s t C a p t i o n > + 
+             < N o 1 _ C u s t   E l e m e n t T y p e = " C o l u m n "   E l e m e n t I d = " 9 1 2 7 7 0 5 0 9 "   D a t a T y p e = " C o d e " > N o 1 _ C u s t < / N o 1 _ C u s t > + 
+             < N o 1 _ C u s t C a p t i o n   E l e m e n t T y p e = " C o l u m n "   E l e m e n t I d = " 1 6 6 1 8 9 3 3 9 7 "   D a t a T y p e = " L a b e l " > N o 1 _ C u s t C a p t i o n < / N o 1 _ C u s t C a p t i o n > + 
+             < O r i g i n a l A m t _ C u s t L e d g E n t r y 2 C a p t i o n   E l e m e n t T y p e = " C o l u m n "   E l e m e n t I d = " 8 4 8 8 4 4 3 9 2 "   D a t a T y p e = " S t r i n g " > O r i g i n a l A m t _ C u s t L e d g E n t r y 2 C a p t i o n < / O r i g i n a l A m t _ C u s t L e d g E n t r y 2 C a p t i o n > + 
+             < P h o n e N o _ C o m p a n y I n f o   E l e m e n t T y p e = " C o l u m n "   E l e m e n t I d = " 1 6 0 6 4 2 8 3 9 4 "   D a t a T y p e = " T e x t " > P h o n e N o _ C o m p a n y I n f o < / P h o n e N o _ C o m p a n y I n f o > + 
+             < P h o n e N o _ C o m p a n y I n f o C a p t i o n   E l e m e n t T y p e = " C o l u m n "   E l e m e n t I d = " 1 8 7 6 0 4 7 7 0 4 "   D a t a T y p e = " L a b e l " > P h o n e N o _ C o m p a n y I n f o C a p t i o n < / P h o n e N o _ C o m p a n y I n f o C a p t i o n > + 
+             < P o s t D a t e _ D t l d C u s t L e d g E n t r i e s C a p t i o n   E l e m e n t T y p e = " C o l u m n "   E l e m e n t I d = " 1 0 3 3 1 2 5 4 2 5 "   D a t a T y p e = " L a b e l " > P o s t D a t e _ D t l d C u s t L e d g E n t r i e s C a p t i o n < / P o s t D a t e _ D t l d C u s t L e d g E n t r i e s C a p t i o n > + 
+             < R e m a i n A m t C u s t L e d g E n t r y 2 C a p t i o n   E l e m e n t T y p e = " C o l u m n "   E l e m e n t I d = " 1 6 3 2 7 0 6 4 0 6 "   D a t a T y p e = " S t r i n g " > R e m a i n A m t C u s t L e d g E n t r y 2 C a p t i o n < / R e m a i n A m t C u s t L e d g E n t r y 2 C a p t i o n > + 
+             < S t a r t D a t e   E l e m e n t T y p e = " C o l u m n "   E l e m e n t I d = " 1 4 5 7 6 6 9 4 1 7 "   D a t a T y p e = " S t r i n g " > S t a r t D a t e < / S t a r t D a t e > + 
+             < S t a r t D a t e C a p t i o n   E l e m e n t T y p e = " C o l u m n "   E l e m e n t I d = " 1 9 8 0 7 4 5 8 7 1 "   D a t a T y p e = " L a b e l " > S t a r t D a t e C a p t i o n < / S t a r t D a t e C a p t i o n > + 
+             < S t a t e m e n t C a p t i o n   E l e m e n t T y p e = " C o l u m n "   E l e m e n t I d = " 2 3 9 3 8 2 "   D a t a T y p e = " L a b e l " > S t a t e m e n t C a p t i o n < / S t a t e m e n t C a p t i o n > + 
+             < T o d a y F o r m a t t e d   E l e m e n t T y p e = " C o l u m n "   E l e m e n t I d = " 2 7 0 4 5 1 4 0 "   D a t a T y p e = " S t r i n g " > T o d a y F o r m a t t e d < / T o d a y F o r m a t t e d > + 
+             < V A T R e g N o _ C o m p a n y I n f o   E l e m e n t T y p e = " C o l u m n "   E l e m e n t I d = " 9 4 4 0 2 9 3 7 7 "   D a t a T y p e = " T e x t " > V A T R e g N o _ C o m p a n y I n f o < / V A T R e g N o _ C o m p a n y I n f o > + 
+             < V A T R e g N o _ C o m p a n y I n f o C a p t i o n   E l e m e n t T y p e = " C o l u m n "   E l e m e n t I d = " 1 1 9 3 2 7 6 3 7 5 "   D a t a T y p e = " L a b e l " > V A T R e g N o _ C o m p a n y I n f o C a p t i o n < / V A T R e g N o _ C o m p a n y I n f o C a p t i o n > + 
+             < C u r r e n c y L o o p   E l e m e n t T y p e = " D a t a I t e m "   E l e m e n t I d = " 1 3 0 4 5 2 2 1 9 8 " > + 
+                 < T o t a l _ C a p t i o n 2   E l e m e n t T y p e = " C o l u m n "   E l e m e n t I d = " 1 9 9 1 3 0 2 6 0 "   D a t a T y p e = " L a b e l " > T o t a l _ C a p t i o n 2 < / T o t a l _ C a p t i o n 2 > + 
+                 < C u s t L e d g E n t r y H d r   E l e m e n t T y p e = " D a t a I t e m "   E l e m e n t I d = " 9 4 2 7 0 7 9 3 2 " > + 
+                     < C u r r e n c y 2 C o d e _ C u s t L e d g E n t r y H d r   E l e m e n t T y p e = " C o l u m n "   E l e m e n t I d = " 1 3 4 9 2 7 9 6 1 1 "   D a t a T y p e = " S t r i n g " > C u r r e n c y 2 C o d e _ C u s t L e d g E n t r y H d r < / C u r r e n c y 2 C o d e _ C u s t L e d g E n t r y H d r > + 
+                     < C u r r e n c y C o d e 3   E l e m e n t T y p e = " C o l u m n "   E l e m e n t I d = " 6 1 8 1 4 2 9 0 8 "   D a t a T y p e = " C o d e " > C u r r e n c y C o d e 3 < / C u r r e n c y C o d e 3 > + 
+                     < C u s t B a l a n c e _ C u s t L e d g E n t r y H d r   E l e m e n t T y p e = " C o l u m n "   E l e m e n t I d = " 4 9 7 1 9 1 3 5 6 "   D a t a T y p e = " D e c i m a l " > C u s t B a l a n c e _ C u s t L e d g E n t r y H d r < / C u s t B a l a n c e _ C u s t L e d g E n t r y H d r > + 
+                     < D t l d C u s t L e d g E n t r y T y p e   E l e m e n t T y p e = " C o l u m n "   E l e m e n t I d = " 8 9 2 0 6 7 4 8 6 "   D a t a T y p e = " S t r i n g " > D t l d C u s t L e d g E n t r y T y p e < / D t l d C u s t L e d g E n t r y T y p e > + 
+                     < E n t r i e s E x i s t s   E l e m e n t T y p e = " C o l u m n "   E l e m e n t I d = " 1 8 9 9 2 2 0 4 1 "   D a t a T y p e = " B o o l e a n " > E n t r i e s E x i s t s < / E n t r i e s E x i s t s > + 
+                     < I s N e w C u s t C u r r e n c y G r o u p   E l e m e n t T y p e = " C o l u m n "   E l e m e n t I d = " 1 1 6 2 5 3 5 5 3 8 "   D a t a T y p e = " B o o l e a n " > I s N e w C u s t C u r r e n c y G r o u p < / I s N e w C u s t C u r r e n c y G r o u p > + 
+                     < P r i n t L i n e   E l e m e n t T y p e = " C o l u m n "   E l e m e n t I d = " 5 9 8 4 7 9 9 9 0 "   D a t a T y p e = " B o o l e a n " > P r i n t L i n e < / P r i n t L i n e > + 
+                     < S t a r t B a l a n c e   E l e m e n t T y p e = " C o l u m n "   E l e m e n t I d = " 3 2 9 4 8 3 5 7 9 "   D a t a T y p e = " D e c i m a l " > S t a r t B a l a n c e < / S t a r t B a l a n c e > + 
+                     < D t l d C u s t L e d g E n t r i e s   E l e m e n t T y p e = " D a t a I t e m "   E l e m e n t I d = " 1 1 1 1 4 6 3 1 7 2 " > + 
+                         < A m t _ D t l d C u s t L e d g E n t r i e s   E l e m e n t T y p e = " C o l u m n "   E l e m e n t I d = " 8 9 7 9 8 5 1 7 9 "   D a t a T y p e = " D e c i m a l " > A m t _ D t l d C u s t L e d g E n t r i e s < / A m t _ D t l d C u s t L e d g E n t r i e s > + 
+                         < C u r r C o d e _ D t l d C u s t L e d g E n t r i e s   E l e m e n t T y p e = " C o l u m n "   E l e m e n t I d = " 3 2 7 0 9 9 9 8 4 "   D a t a T y p e = " C o d e " > C u r r C o d e _ D t l d C u s t L e d g E n t r i e s < / C u r r C o d e _ D t l d C u s t L e d g E n t r i e s > + 
+                         < C u r r e n c y 2 C o d e   E l e m e n t T y p e = " C o l u m n "   E l e m e n t I d = " 4 6 5 9 9 3 8 2 7 "   D a t a T y p e = " C o d e " > C u r r e n c y 2 C o d e < / C u r r e n c y 2 C o d e > + 
+                         < C u s t B a l a n c e   E l e m e n t T y p e = " C o l u m n "   E l e m e n t I d = " 1 4 1 3 7 0 1 5 0 2 "   D a t a T y p e = " D e c i m a l " > C u s t B a l a n c e < / C u s t B a l a n c e > + 
+                         < D e s c r i p t i o n   E l e m e n t T y p e = " C o l u m n "   E l e m e n t I d = " 1 3 1 4 3 5 1 3 0 7 "   D a t a T y p e = " T e x t " > D e s c r i p t i o n < / D e s c r i p t i o n > + 
+                         < D o c N o _ D t l d C u s t L e d g E n t r i e s   E l e m e n t T y p e = " C o l u m n "   E l e m e n t I d = " 2 2 4 2 9 8 6 5 4 "   D a t a T y p e = " C o d e " > D o c N o _ D t l d C u s t L e d g E n t r i e s < / D o c N o _ D t l d C u s t L e d g E n t r i e s > + 
+                         < D u e D a t e _ D t l d C u s t L e d g E n t r i e s   E l e m e n t T y p e = " C o l u m n "   E l e m e n t I d = " 1 4 1 7 8 6 1 6 0 3 "   D a t a T y p e = " S t r i n g " > D u e D a t e _ D t l d C u s t L e d g E n t r i e s < / D u e D a t e _ D t l d C u s t L e d g E n t r i e s > + 
+                         < P o s t D a t e _ D t l d C u s t L e d g E n t r i e s   E l e m e n t T y p e = " C o l u m n "   E l e m e n t I d = " 1 6 8 8 2 9 9 9 1 3 "   D a t a T y p e = " S t r i n g " > P o s t D a t e _ D t l d C u s t L e d g E n t r i e s < / P o s t D a t e _ D t l d C u s t L e d g E n t r i e s > + 
+                         < R e m a i n A m t _ D t l d C u s t L e d g E n t r i e s   E l e m e n t T y p e = " C o l u m n "   E l e m e n t I d = " 1 4 5 7 2 4 8 8 2 5 "   D a t a T y p e = " D e c i m a l " > R e m a i n A m t _ D t l d C u s t L e d g E n t r i e s < / R e m a i n A m t _ D t l d C u s t L e d g E n t r i e s > + 
+                         < Y o u r R e f e r e n c e _ D t l d C u s t L e d g E n t r i e s   E l e m e n t T y p e = " C o l u m n "   E l e m e n t I d = " 6 7 5 1 3 6 1 6 7 "   D a t a T y p e = " T e x t " > Y o u r R e f e r e n c e _ D t l d C u s t L e d g E n t r i e s < / Y o u r R e f e r e n c e _ D t l d C u s t L e d g E n t r i e s >   
                      < / D t l d C u s t L e d g E n t r i e s >   
                  < / C u s t L e d g E n t r y H d r >   
-                 < C u s t L e d g E n t r y F o o t e r > - 
-                     < C u r r e n c y C o d e 3 _ C u s t L e d g E n t r y F o o t e r > C u r r e n c y C o d e 3 _ C u s t L e d g E n t r y F o o t e r < / C u r r e n c y C o d e 3 _ C u s t L e d g E n t r y F o o t e r > - 
-                     < C u s t B a l a n c e _ C u s t L e d g E n t r y H d r F o o t e r > C u s t B a l a n c e _ C u s t L e d g E n t r y H d r F o o t e r < / C u s t B a l a n c e _ C u s t L e d g E n t r y H d r F o o t e r > - 
-                     < E n t r i e s E x i s t s l _ C u s t L e d g E n t r y F o o t e r C a p t i o n > E n t r i e s E x i s t s l _ C u s t L e d g E n t r y F o o t e r C a p t i o n < / E n t r i e s E x i s t s l _ C u s t L e d g E n t r y F o o t e r C a p t i o n > - 
-                     < T o t a l _ C a p t i o n > T o t a l _ C a p t i o n < / T o t a l _ C a p t i o n > +                 < C u s t L e d g E n t r y F o o t e r   E l e m e n t T y p e = " D a t a I t e m "   E l e m e n t I d = " 9 2 5 1 1 8 7 3 5 " > + 
+                     < C u r r e n c y C o d e 3 _ C u s t L e d g E n t r y F o o t e r   E l e m e n t T y p e = " C o l u m n "   E l e m e n t I d = " 1 7 6 5 6 9 2 8 1 "   D a t a T y p e = " C o d e " > C u r r e n c y C o d e 3 _ C u s t L e d g E n t r y F o o t e r < / C u r r e n c y C o d e 3 _ C u s t L e d g E n t r y F o o t e r > + 
+                     < C u s t B a l a n c e _ C u s t L e d g E n t r y H d r F o o t e r   E l e m e n t T y p e = " C o l u m n "   E l e m e n t I d = " 1 3 6 7 2 1 4 5 9 3 "   D a t a T y p e = " D e c i m a l " > C u s t B a l a n c e _ C u s t L e d g E n t r y H d r F o o t e r < / C u s t B a l a n c e _ C u s t L e d g E n t r y H d r F o o t e r > + 
+                     < E n t r i e s E x i s t s l _ C u s t L e d g E n t r y F o o t e r C a p t i o n   E l e m e n t T y p e = " C o l u m n "   E l e m e n t I d = " 1 1 7 7 0 6 9 2 3 2 "   D a t a T y p e = " B o o l e a n " > E n t r i e s E x i s t s l _ C u s t L e d g E n t r y F o o t e r C a p t i o n < / E n t r i e s E x i s t s l _ C u s t L e d g E n t r y F o o t e r C a p t i o n > + 
+                     < T o t a l _ C a p t i o n   E l e m e n t T y p e = " C o l u m n "   E l e m e n t I d = " 6 1 1 5 9 7 6 3 4 "   D a t a T y p e = " L a b e l " > T o t a l _ C a p t i o n < / T o t a l _ C a p t i o n >   
                  < / C u s t L e d g E n t r y F o o t e r >   
-                 < O v e r d u e V i s i b l e > - 
-                     < C u r r e n c y C o d e 3 _ C u s t L e d g E n t r y 2 > C u r r e n c y C o d e 3 _ C u s t L e d g E n t r y 2 < / C u r r e n c y C o d e 3 _ C u s t L e d g E n t r y 2 > - 
-                     < D e s c _ C u s t L e d g E n t r y 2 C a p t i o n 2 > D e s c _ C u s t L e d g E n t r y 2 C a p t i o n 2 < / D e s c _ C u s t L e d g E n t r y 2 C a p t i o n 2 > - 
-                     < D o c N o _ D t l d C u s t L e d g E n t r i e s C a p t i o n 2 > D o c N o _ D t l d C u s t L e d g E n t r i e s C a p t i o n 2 < / D o c N o _ D t l d C u s t L e d g E n t r i e s C a p t i o n 2 > - 
-                     < D u e D a t e _ C u s t L e d g E n t r y 2 C a p t i o n 2 > D u e D a t e _ C u s t L e d g E n t r y 2 C a p t i o n 2 < / D u e D a t e _ C u s t L e d g E n t r y 2 C a p t i o n 2 > - 
-                     < O r i g i n a l A m t _ C u s t L e d g E n t r y 2 C a p t i o n 2 > O r i g i n a l A m t _ C u s t L e d g E n t r y 2 C a p t i o n 2 < / O r i g i n a l A m t _ C u s t L e d g E n t r y 2 C a p t i o n 2 > - 
-                     < O v e r D u e E n t r i e s > O v e r D u e E n t r i e s < / O v e r D u e E n t r i e s > - 
-                     < P o s t D a t e _ D t l d C u s t L e d g E n t r i e s C a p t i o n 2 > P o s t D a t e _ D t l d C u s t L e d g E n t r i e s C a p t i o n 2 < / P o s t D a t e _ D t l d C u s t L e d g E n t r i e s C a p t i o n 2 > - 
-                     < R e m a i n A m t C u s t L e d g E n t r y 2 C a p t i o n 2 > R e m a i n A m t C u s t L e d g E n t r y 2 C a p t i o n 2 < / R e m a i n A m t C u s t L e d g E n t r y 2 C a p t i o n 2 > - 
-                     < T o t a l _ C a p t i o n 3 > T o t a l _ C a p t i o n 3 < / T o t a l _ C a p t i o n 3 > - 
-                     < C u s t L e d g E n t r y 2 > - 
-                         < C u r r C o d e _ C u s t L e d g E n t r y 2 > C u r r C o d e _ C u s t L e d g E n t r y 2 < / C u r r C o d e _ C u s t L e d g E n t r y 2 > - 
-                         < C u r r e n c y 2 C o d e _ C u s t L e d g E n t r y 2 > C u r r e n c y 2 C o d e _ C u s t L e d g E n t r y 2 < / C u r r e n c y 2 C o d e _ C u s t L e d g E n t r y 2 > - 
-                         < C u s t N o _ C u s t L e d g E n t r y 2 > C u s t N o _ C u s t L e d g E n t r y 2 < / C u s t N o _ C u s t L e d g E n t r y 2 > - 
-                         < D e s c _ C u s t L e d g E n t r y 2 > D e s c _ C u s t L e d g E n t r y 2 < / D e s c _ C u s t L e d g E n t r y 2 > - 
-                         < D o c N o _ C u s t L e d g E n t r y 2 > D o c N o _ C u s t L e d g E n t r y 2 < / D o c N o _ C u s t L e d g E n t r y 2 > - 
-                         < D u e D a t e _ C u s t L e d g E n t r y 2 > D u e D a t e _ C u s t L e d g E n t r y 2 < / D u e D a t e _ C u s t L e d g E n t r y 2 > - 
-                         < O r i g i n a l A m t _ C u s t L e d g E n t r y 2 > O r i g i n a l A m t _ C u s t L e d g E n t r y 2 < / O r i g i n a l A m t _ C u s t L e d g E n t r y 2 > - 
-                         < P o s t D a t e _ C u s t L e d g E n t r y 2 > P o s t D a t e _ C u s t L e d g E n t r y 2 < / P o s t D a t e _ C u s t L e d g E n t r y 2 > - 
-                         < P r i n t E n t r i e s D u e > P r i n t E n t r i e s D u e < / P r i n t E n t r i e s D u e > - 
-                         < R e m a i n A m t _ C u s t L e d g E n t r y 2 > R e m a i n A m t _ C u s t L e d g E n t r y 2 < / R e m a i n A m t _ C u s t L e d g E n t r y 2 > - 
-                         < Y o u r R e f e r e n c e _ C u s t L e d g E n t r y 2 > Y o u r R e f e r e n c e _ C u s t L e d g E n t r y 2 < / Y o u r R e f e r e n c e _ C u s t L e d g E n t r y 2 > +                 < O v e r d u e V i s i b l e   E l e m e n t T y p e = " D a t a I t e m "   E l e m e n t I d = " 1 4 2 6 6 4 4 0 8 7 " > + 
+                     < C u r r e n c y C o d e 3 _ C u s t L e d g E n t r y 2   E l e m e n t T y p e = " C o l u m n "   E l e m e n t I d = " 1 4 9 4 2 9 8 6 2 2 "   D a t a T y p e = " C o d e " > C u r r e n c y C o d e 3 _ C u s t L e d g E n t r y 2 < / C u r r e n c y C o d e 3 _ C u s t L e d g E n t r y 2 > + 
+                     < D e s c _ C u s t L e d g E n t r y 2 C a p t i o n 2   E l e m e n t T y p e = " C o l u m n "   E l e m e n t I d = " 1 9 5 4 6 4 5 1 6 2 "   D a t a T y p e = " S t r i n g " > D e s c _ C u s t L e d g E n t r y 2 C a p t i o n 2 < / D e s c _ C u s t L e d g E n t r y 2 C a p t i o n 2 > + 
+                     < D o c N o _ D t l d C u s t L e d g E n t r i e s C a p t i o n 2   E l e m e n t T y p e = " C o l u m n "   E l e m e n t I d = " 1 0 9 6 5 7 7 3 7 8 "   D a t a T y p e = " S t r i n g " > D o c N o _ D t l d C u s t L e d g E n t r i e s C a p t i o n 2 < / D o c N o _ D t l d C u s t L e d g E n t r i e s C a p t i o n 2 > + 
+                     < D u e D a t e _ C u s t L e d g E n t r y 2 C a p t i o n 2   E l e m e n t T y p e = " C o l u m n "   E l e m e n t I d = " 9 0 1 1 8 8 6 8 5 "   D a t a T y p e = " L a b e l " > D u e D a t e _ C u s t L e d g E n t r y 2 C a p t i o n 2 < / D u e D a t e _ C u s t L e d g E n t r y 2 C a p t i o n 2 > + 
+                     < O r i g i n a l A m t _ C u s t L e d g E n t r y 2 C a p t i o n 2   E l e m e n t T y p e = " C o l u m n "   E l e m e n t I d = " 1 6 4 9 8 2 3 4 6 6 "   D a t a T y p e = " S t r i n g " > O r i g i n a l A m t _ C u s t L e d g E n t r y 2 C a p t i o n 2 < / O r i g i n a l A m t _ C u s t L e d g E n t r y 2 C a p t i o n 2 > + 
+                     < O v e r D u e E n t r i e s   E l e m e n t T y p e = " C o l u m n "   E l e m e n t I d = " 2 3 9 2 5 5 2 1 3 "   D a t a T y p e = " S t r i n g " > O v e r D u e E n t r i e s < / O v e r D u e E n t r i e s > + 
+                     < P o s t D a t e _ D t l d C u s t L e d g E n t r i e s C a p t i o n 2   E l e m e n t T y p e = " C o l u m n "   E l e m e n t I d = " 7 1 5 0 7 2 1 9 7 "   D a t a T y p e = " L a b e l " > P o s t D a t e _ D t l d C u s t L e d g E n t r i e s C a p t i o n 2 < / P o s t D a t e _ D t l d C u s t L e d g E n t r i e s C a p t i o n 2 > + 
+                     < R e m a i n A m t C u s t L e d g E n t r y 2 C a p t i o n 2   E l e m e n t T y p e = " C o l u m n "   E l e m e n t I d = " 5 0 5 0 3 3 9 6 0 "   D a t a T y p e = " S t r i n g " > R e m a i n A m t C u s t L e d g E n t r y 2 C a p t i o n 2 < / R e m a i n A m t C u s t L e d g E n t r y 2 C a p t i o n 2 > + 
+                     < T o t a l _ C a p t i o n 3   E l e m e n t T y p e = " C o l u m n "   E l e m e n t I d = " 4 3 8 5 6 6 3 5 7 "   D a t a T y p e = " L a b e l " > T o t a l _ C a p t i o n 3 < / T o t a l _ C a p t i o n 3 > + 
+                     < C u s t L e d g E n t r y 2   E l e m e n t T y p e = " D a t a I t e m "   E l e m e n t I d = " 1 3 7 2 6 3 7 0 0 8 " > + 
+                         < C u r r C o d e _ C u s t L e d g E n t r y 2   E l e m e n t T y p e = " C o l u m n "   E l e m e n t I d = " 1 5 8 9 5 4 6 2 6 8 "   D a t a T y p e = " C o d e " > C u r r C o d e _ C u s t L e d g E n t r y 2 < / C u r r C o d e _ C u s t L e d g E n t r y 2 > + 
+                         < C u r r e n c y 2 C o d e _ C u s t L e d g E n t r y 2   E l e m e n t T y p e = " C o l u m n "   E l e m e n t I d = " 1 4 2 6 8 6 9 3 0 3 "   D a t a T y p e = " C o d e " > C u r r e n c y 2 C o d e _ C u s t L e d g E n t r y 2 < / C u r r e n c y 2 C o d e _ C u s t L e d g E n t r y 2 > + 
+                         < C u s t N o _ C u s t L e d g E n t r y 2   E l e m e n t T y p e = " C o l u m n "   E l e m e n t I d = " 1 3 5 3 0 8 9 7 4 5 "   D a t a T y p e = " C o d e " > C u s t N o _ C u s t L e d g E n t r y 2 < / C u s t N o _ C u s t L e d g E n t r y 2 > + 
+                         < D e s c _ C u s t L e d g E n t r y 2   E l e m e n t T y p e = " C o l u m n "   E l e m e n t I d = " 4 0 4 4 4 3 7 9 8 "   D a t a T y p e = " T e x t " > D e s c _ C u s t L e d g E n t r y 2 < / D e s c _ C u s t L e d g E n t r y 2 > + 
+                         < D o c N o _ C u s t L e d g E n t r y 2   E l e m e n t T y p e = " C o l u m n "   E l e m e n t I d = " 5 1 0 9 1 4 9 4 "   D a t a T y p e = " C o d e " > D o c N o _ C u s t L e d g E n t r y 2 < / D o c N o _ C u s t L e d g E n t r y 2 > + 
+                         < D u e D a t e _ C u s t L e d g E n t r y 2   E l e m e n t T y p e = " C o l u m n "   E l e m e n t I d = " 1 6 3 5 3 6 3 6 4 7 "   D a t a T y p e = " S t r i n g " > D u e D a t e _ C u s t L e d g E n t r y 2 < / D u e D a t e _ C u s t L e d g E n t r y 2 > + 
+                         < O r i g i n a l A m t _ C u s t L e d g E n t r y 2   E l e m e n t T y p e = " C o l u m n "   E l e m e n t I d = " 6 5 4 0 4 5 0 9 8 "   D a t a T y p e = " D e c i m a l " > O r i g i n a l A m t _ C u s t L e d g E n t r y 2 < / O r i g i n a l A m t _ C u s t L e d g E n t r y 2 > + 
+                         < P o s t D a t e _ C u s t L e d g E n t r y 2   E l e m e n t T y p e = " C o l u m n "   E l e m e n t I d = " 1 8 1 7 1 9 2 0 4 3 "   D a t a T y p e = " S t r i n g " > P o s t D a t e _ C u s t L e d g E n t r y 2 < / P o s t D a t e _ C u s t L e d g E n t r y 2 > + 
+                         < P r i n t E n t r i e s D u e   E l e m e n t T y p e = " C o l u m n "   E l e m e n t I d = " 6 9 3 7 0 0 1 2 6 "   D a t a T y p e = " B o o l e a n " > P r i n t E n t r i e s D u e < / P r i n t E n t r i e s D u e > + 
+                         < R e m a i n A m t _ C u s t L e d g E n t r y 2   E l e m e n t T y p e = " C o l u m n "   E l e m e n t I d = " 7 5 6 3 4 5 4 1 3 "   D a t a T y p e = " D e c i m a l " > R e m a i n A m t _ C u s t L e d g E n t r y 2 < / R e m a i n A m t _ C u s t L e d g E n t r y 2 > + 
+                         < Y o u r R e f e r e n c e _ C u s t L e d g E n t r y 2   E l e m e n t T y p e = " C o l u m n "   E l e m e n t I d = " 2 0 5 5 4 0 4 3 9 5 "   D a t a T y p e = " T e x t " > Y o u r R e f e r e n c e _ C u s t L e d g E n t r y 2 < / Y o u r R e f e r e n c e _ C u s t L e d g E n t r y 2 >   
                      < / C u s t L e d g E n t r y 2 >   
-                     < O v e r d u e E n t r y F o o d e r > - 
-                         < O v e r d u e B a l a n c e > O v e r d u e B a l a n c e < / O v e r d u e B a l a n c e > +                     < O v e r d u e E n t r y F o o d e r   E l e m e n t T y p e = " D a t a I t e m "   E l e m e n t I d = " 1 6 5 9 2 3 5 9 3 4 " > + 
+                         < O v e r d u e B a l a n c e   E l e m e n t T y p e = " C o l u m n "   E l e m e n t I d = " 1 1 8 6 1 4 8 4 3 9 "   D a t a T y p e = " D e c i m a l " > O v e r d u e B a l a n c e < / O v e r d u e B a l a n c e >   
                      < / O v e r d u e E n t r y F o o d e r >   
@@ -7600,51 +7562,51 @@
  
              < / C u r r e n c y L o o p >   
-             < A g i n g B a n d V i s i b l e > - 
-                 < A g i n g C u s t L e d g E n t r y   / > - 
-                 < A g i n g B a n d L o o p > - 
-                     < A g i n g B a n d B u f C o l 1 A m t > A g i n g B a n d B u f C o l 1 A m t < / A g i n g B a n d B u f C o l 1 A m t > - 
-                     < A g i n g B a n d B u f C o l 2 A m t > A g i n g B a n d B u f C o l 2 A m t < / A g i n g B a n d B u f C o l 2 A m t > - 
-                     < A g i n g B a n d B u f C o l 3 A m t > A g i n g B a n d B u f C o l 3 A m t < / A g i n g B a n d B u f C o l 3 A m t > - 
-                     < A g i n g B a n d B u f C o l 4 A m t > A g i n g B a n d B u f C o l 4 A m t < / A g i n g B a n d B u f C o l 4 A m t > - 
-                     < A g i n g B a n d B u f C o l 5 A m t > A g i n g B a n d B u f C o l 5 A m t < / A g i n g B a n d B u f C o l 5 A m t > - 
-                     < A g i n g B a n d C u r r e n c y C o d e > A g i n g B a n d C u r r e n c y C o d e < / A g i n g B a n d C u r r e n c y C o d e > - 
-                     < A g i n g B a n d E n d i n g D a t e > A g i n g B a n d E n d i n g D a t e < / A g i n g B a n d E n d i n g D a t e > - 
-                     < A g i n g D a t e 1 > A g i n g D a t e 1 < / A g i n g D a t e 1 > - 
-                     < A g i n g D a t e 2 > A g i n g D a t e 2 < / A g i n g D a t e 2 > - 
-                     < A g i n g D a t e 2 1 > A g i n g D a t e 2 1 < / A g i n g D a t e 2 1 > - 
-                     < A g i n g D a t e 3 > A g i n g D a t e 3 < / A g i n g D a t e 3 > - 
-                     < A g i n g D a t e 3 1 > A g i n g D a t e 3 1 < / A g i n g D a t e 3 1 > - 
-                     < A g i n g D a t e 4 > A g i n g D a t e 4 < / A g i n g D a t e 4 > - 
-                     < A g i n g D a t e 4 1 > A g i n g D a t e 4 1 < / A g i n g D a t e 4 1 > - 
-                     < A g i n g D a t e 5 > A g i n g D a t e 5 < / A g i n g D a t e 5 > - 
-                     < A g i n g D a t e H e a d e r 1 > A g i n g D a t e H e a d e r 1 < / A g i n g D a t e H e a d e r 1 > - 
-                     < A g i n g D a t e H e a d e r 2 > A g i n g D a t e H e a d e r 2 < / A g i n g D a t e H e a d e r 2 > - 
-                     < A g i n g D a t e H e a d e r 3 > A g i n g D a t e H e a d e r 3 < / A g i n g D a t e H e a d e r 3 > - 
-                     < A g i n g D a t e H e a d e r 4 > A g i n g D a t e H e a d e r 4 < / A g i n g D a t e H e a d e r 4 > - 
-                     < b e f o r e C a p t i o n > b e f o r e C a p t i o n < / b e f o r e C a p t i o n > +             < A g i n g B a n d V i s i b l e   E l e m e n t T y p e = " D a t a I t e m "   E l e m e n t I d = " 1 9 4 1 7 6 5 1 4 0 " > + 
+                 < A g i n g C u s t L e d g E n t r y   E l e m e n t T y p e = " D a t a I t e m "   E l e m e n t I d = " 7 0 4 1 6 5 1 3 2 " / > + 
+                 < A g i n g B a n d L o o p   E l e m e n t T y p e = " D a t a I t e m "   E l e m e n t I d = " 1 5 2 9 3 9 4 0 2 2 " > + 
+                     < A g i n g B a n d B u f C o l 1 A m t   E l e m e n t T y p e = " C o l u m n "   E l e m e n t I d = " 1 9 4 8 7 4 9 4 5 4 "   D a t a T y p e = " D e c i m a l " > A g i n g B a n d B u f C o l 1 A m t < / A g i n g B a n d B u f C o l 1 A m t > + 
+                     < A g i n g B a n d B u f C o l 2 A m t   E l e m e n t T y p e = " C o l u m n "   E l e m e n t I d = " 1 9 5 6 4 3 5 6 1 5 "   D a t a T y p e = " D e c i m a l " > A g i n g B a n d B u f C o l 2 A m t < / A g i n g B a n d B u f C o l 2 A m t > + 
+                     < A g i n g B a n d B u f C o l 3 A m t   E l e m e n t T y p e = " C o l u m n "   E l e m e n t I d = " 9 7 5 6 7 9 1 5 2 "   D a t a T y p e = " D e c i m a l " > A g i n g B a n d B u f C o l 3 A m t < / A g i n g B a n d B u f C o l 3 A m t > + 
+                     < A g i n g B a n d B u f C o l 4 A m t   E l e m e n t T y p e = " C o l u m n "   E l e m e n t I d = " 1 2 3 5 5 5 5 7 0 5 "   D a t a T y p e = " D e c i m a l " > A g i n g B a n d B u f C o l 4 A m t < / A g i n g B a n d B u f C o l 4 A m t > + 
+                     < A g i n g B a n d B u f C o l 5 A m t   E l e m e n t T y p e = " C o l u m n "   E l e m e n t I d = " 4 2 4 7 8 1 3 0 2 "   D a t a T y p e = " D e c i m a l " > A g i n g B a n d B u f C o l 5 A m t < / A g i n g B a n d B u f C o l 5 A m t > + 
+                     < A g i n g B a n d C u r r e n c y C o d e   E l e m e n t T y p e = " C o l u m n "   E l e m e n t I d = " 1 3 1 1 1 3 8 9 6 8 "   D a t a T y p e = " C o d e " > A g i n g B a n d C u r r e n c y C o d e < / A g i n g B a n d C u r r e n c y C o d e > + 
+                     < A g i n g B a n d E n d i n g D a t e   E l e m e n t T y p e = " C o l u m n "   E l e m e n t I d = " 1 3 9 0 8 7 6 8 7 "   D a t a T y p e = " S t r i n g " > A g i n g B a n d E n d i n g D a t e < / A g i n g B a n d E n d i n g D a t e > + 
+                     < A g i n g D a t e 1   E l e m e n t T y p e = " C o l u m n "   E l e m e n t I d = " 4 7 9 6 0 6 2 6 6 "   D a t a T y p e = " S t r i n g " > A g i n g D a t e 1 < / A g i n g D a t e 1 > + 
+                     < A g i n g D a t e 2   E l e m e n t T y p e = " C o l u m n "   E l e m e n t I d = " 1 1 1 7 3 0 2 8 8 3 "   D a t a T y p e = " S t r i n g " > A g i n g D a t e 2 < / A g i n g D a t e 2 > + 
+                     < A g i n g D a t e 2 1   E l e m e n t T y p e = " C o l u m n "   E l e m e n t I d = " 3 1 3 5 0 1 0 6 8 "   D a t a T y p e = " S t r i n g " > A g i n g D a t e 2 1 < / A g i n g D a t e 2 1 > + 
+                     < A g i n g D a t e 3   E l e m e n t T y p e = " C o l u m n "   E l e m e n t I d = " 1 7 5 4 9 9 9 5 0 0 "   D a t a T y p e = " S t r i n g " > A g i n g D a t e 3 < / A g i n g D a t e 3 > + 
+                     < A g i n g D a t e 3 1   E l e m e n t T y p e = " C o l u m n "   E l e m e n t I d = " 1 9 1 4 0 6 0 5 3 1 "   D a t a T y p e = " S t r i n g " > A g i n g D a t e 3 1 < / A g i n g D a t e 3 1 > + 
+                     < A g i n g D a t e 4   E l e m e n t T y p e = " C o l u m n "   E l e m e n t I d = " 1 9 0 2 2 7 1 1 7 9 "   D a t a T y p e = " S t r i n g " > A g i n g D a t e 4 < / A g i n g D a t e 4 > + 
+                     < A g i n g D a t e 4 1   E l e m e n t T y p e = " C o l u m n "   E l e m e n t I d = " 8 4 9 7 6 9 6 1 0 "   D a t a T y p e = " S t r i n g " > A g i n g D a t e 4 1 < / A g i n g D a t e 4 1 > + 
+                     < A g i n g D a t e 5   E l e m e n t T y p e = " C o l u m n "   E l e m e n t I d = " 1 2 6 4 5 7 4 5 6 2 "   D a t a T y p e = " S t r i n g " > A g i n g D a t e 5 < / A g i n g D a t e 5 > + 
+                     < A g i n g D a t e H e a d e r 1   E l e m e n t T y p e = " C o l u m n "   E l e m e n t I d = " 2 8 6 3 5 0 7 5 9 "   D a t a T y p e = " T e x t " > A g i n g D a t e H e a d e r 1 < / A g i n g D a t e H e a d e r 1 > + 
+                     < A g i n g D a t e H e a d e r 2   E l e m e n t T y p e = " C o l u m n "   E l e m e n t I d = " 3 5 1 3 4 5 8 5 8 "   D a t a T y p e = " T e x t " > A g i n g D a t e H e a d e r 2 < / A g i n g D a t e H e a d e r 2 > + 
+                     < A g i n g D a t e H e a d e r 3   E l e m e n t T y p e = " C o l u m n "   E l e m e n t I d = " 9 8 9 0 4 2 4 7 5 "   D a t a T y p e = " T e x t " > A g i n g D a t e H e a d e r 3 < / A g i n g D a t e H e a d e r 3 > + 
+                     < A g i n g D a t e H e a d e r 4   E l e m e n t T y p e = " C o l u m n "   E l e m e n t I d = " 1 6 2 6 7 3 9 0 9 2 "   D a t a T y p e = " T e x t " > A g i n g D a t e H e a d e r 4 < / A g i n g D a t e H e a d e r 4 > + 
+                     < b e f o r e C a p t i o n   E l e m e n t T y p e = " C o l u m n "   E l e m e n t I d = " 1 0 1 3 0 1 9 7 1 8 "   D a t a T y p e = " L a b e l " > b e f o r e C a p t i o n < / b e f o r e C a p t i o n >   
                  < / A g i n g B a n d L o o p >   
@@ -7652,13 +7614,13 @@
  
          < / I n t e g e r >   
-         < L e t t e r T e x t > - 
-             < B o d y T e x t > B o d y T e x t < / B o d y T e x t > - 
-             < C l o s i n g T e x t > C l o s i n g T e x t < / C l o s i n g T e x t > - 
-             < G r e e t i n g T e x t > G r e e t i n g T e x t < / G r e e t i n g T e x t > +         < L e t t e r T e x t   E l e m e n t T y p e = " D a t a I t e m "   E l e m e n t I d = " 1 5 1 0 3 5 3 8 3 4 " > + 
+             < B o d y T e x t   E l e m e n t T y p e = " C o l u m n "   E l e m e n t I d = " 1 4 9 7 5 9 8 0 8 "   D a t a T y p e = " L a b e l " > B o d y T e x t < / B o d y T e x t > + 
+             < C l o s i n g T e x t   E l e m e n t T y p e = " C o l u m n "   E l e m e n t I d = " 5 1 2 1 3 5 9 0 9 "   D a t a T y p e = " L a b e l " > C l o s i n g T e x t < / C l o s i n g T e x t > + 
+             < G r e e t i n g T e x t   E l e m e n t T y p e = " C o l u m n "   E l e m e n t I d = " 1 1 7 5 2 7 9 2 8 9 "   D a t a T y p e = " L a b e l " > G r e e t i n g T e x t < / G r e e t i n g T e x t >   
          < / L e t t e r T e x t >   
@@ -7667,14 +7629,10 @@
  < / N a v W o r d R e p o r t X m l P a r t > 
 </file>
 
-<file path=customXml/item3.xml><?xml version="1.0" encoding="utf-8"?>
-<b:Sources xmlns:b="http://schemas.openxmlformats.org/officeDocument/2006/bibliography" xmlns="http://schemas.openxmlformats.org/officeDocument/2006/bibliography" SelectedStyle="\apasixtheditionofficeonline.xsl" StyleName="APA" Version="6"/>
-</file>
-
 <file path=customXml/itemProps1.xml><?xml version="1.0" encoding="utf-8"?>
-<ds:datastoreItem xmlns:ds="http://schemas.openxmlformats.org/officeDocument/2006/customXml" ds:itemID="{F7EEA1EF-F088-48B3-A77F-0F97170C0FF3}">
+<ds:datastoreItem xmlns:ds="http://schemas.openxmlformats.org/officeDocument/2006/customXml" ds:itemID="{9CB80131-D8C5-4FD0-8654-DF7242DD7038}">
   <ds:schemaRefs>
-    <ds:schemaRef ds:uri="urn:microsoft-dynamics-businesscentral/internal/extended/reports/Standard_Statement/1316/"/>
+    <ds:schemaRef ds:uri="http://schemas.openxmlformats.org/officeDocument/2006/bibliography"/>
   </ds:schemaRefs>
 </ds:datastoreItem>
 </file>
@@ -7688,9 +7646,9 @@
 </file>
 
 <file path=customXml/itemProps3.xml><?xml version="1.0" encoding="utf-8"?>
-<ds:datastoreItem xmlns:ds="http://schemas.openxmlformats.org/officeDocument/2006/customXml" ds:itemID="{9CB80131-D8C5-4FD0-8654-DF7242DD7038}">
+<ds:datastoreItem xmlns:ds="http://schemas.openxmlformats.org/officeDocument/2006/customXml" ds:itemID="{F7EEA1EF-F088-48B3-A77F-0F97170C0FF3}">
   <ds:schemaRefs>
-    <ds:schemaRef ds:uri="http://schemas.openxmlformats.org/officeDocument/2006/bibliography"/>
+    <ds:schemaRef ds:uri="urn:microsoft-dynamics-businesscentral/internal/extended/reports/Standard_Statement/1316/"/>
   </ds:schemaRefs>
 </ds:datastoreItem>
 </file>
</xml_diff>